<commit_message>
Make the Source repo reference clickable on the title page and Document Control
The title page and Document Control attribute tables displayed the
GitHub repo as plain text; both now use the same hyperlink target as
Appendix E.1, so the repo is one click away wherever it's referenced.

Co-authored-by: Copilot <223556219+Copilot@users.noreply.github.com>
</commit_message>
<xml_diff>
--- a/docs/Contract-and-Legal-Intelligence-Agent-Lab-Guide.docx
+++ b/docs/Contract-and-Legal-Intelligence-Agent-Lab-Guide.docx
@@ -293,13 +293,16 @@
             <w:vAlign w:val="center"/>
           </w:tcPr>
           <w:p>
-            <w:r>
-              <w:rPr>
-                <w:sz w:val="19"/>
-                <w:szCs w:val="19"/>
-              </w:rPr>
-              <w:t>github.com/spetren/contract-legal-intelligence-agent-lab</w:t>
-            </w:r>
+            <w:hyperlink r:id="rId5" w:history="1">
+              <w:r>
+                <w:rPr>
+                  <w:rStyle w:val="Hyperlink"/>
+                  <w:sz w:val="19"/>
+                  <w:szCs w:val="19"/>
+                </w:rPr>
+                <w:t>github.com/spetren/contract-legal-intelligence-agent-lab</w:t>
+              </w:r>
+            </w:hyperlink>
           </w:p>
         </w:tc>
       </w:tr>
@@ -638,7 +641,7 @@
           <w:r>
             <w:fldChar w:fldCharType="separate"/>
           </w:r>
-          <w:hyperlink w:anchor="_Toc240268385" w:history="1">
+          <w:hyperlink w:anchor="_Toc240277883" w:history="1">
             <w:r>
               <w:rPr>
                 <w:rStyle w:val="Hyperlink"/>
@@ -664,7 +667,7 @@
               <w:rPr>
                 <w:noProof/>
               </w:rPr>
-              <w:instrText xml:space="preserve"> PAGEREF _Toc240268385 \h </w:instrText>
+              <w:instrText xml:space="preserve"> PAGEREF _Toc240277883 \h </w:instrText>
             </w:r>
             <w:r>
               <w:rPr>
@@ -706,7 +709,7 @@
               <w14:ligatures w14:val="standardContextual"/>
             </w:rPr>
           </w:pPr>
-          <w:hyperlink w:anchor="_Toc240268386" w:history="1">
+          <w:hyperlink w:anchor="_Toc240277884" w:history="1">
             <w:r>
               <w:rPr>
                 <w:rStyle w:val="Hyperlink"/>
@@ -732,7 +735,7 @@
               <w:rPr>
                 <w:noProof/>
               </w:rPr>
-              <w:instrText xml:space="preserve"> PAGEREF _Toc240268386 \h </w:instrText>
+              <w:instrText xml:space="preserve"> PAGEREF _Toc240277884 \h </w:instrText>
             </w:r>
             <w:r>
               <w:rPr>
@@ -774,7 +777,7 @@
               <w14:ligatures w14:val="standardContextual"/>
             </w:rPr>
           </w:pPr>
-          <w:hyperlink w:anchor="_Toc240268387" w:history="1">
+          <w:hyperlink w:anchor="_Toc240277885" w:history="1">
             <w:r>
               <w:rPr>
                 <w:rStyle w:val="Hyperlink"/>
@@ -800,7 +803,7 @@
               <w:rPr>
                 <w:noProof/>
               </w:rPr>
-              <w:instrText xml:space="preserve"> PAGEREF _Toc240268387 \h </w:instrText>
+              <w:instrText xml:space="preserve"> PAGEREF _Toc240277885 \h </w:instrText>
             </w:r>
             <w:r>
               <w:rPr>
@@ -842,7 +845,7 @@
               <w14:ligatures w14:val="standardContextual"/>
             </w:rPr>
           </w:pPr>
-          <w:hyperlink w:anchor="_Toc240268388" w:history="1">
+          <w:hyperlink w:anchor="_Toc240277886" w:history="1">
             <w:r>
               <w:rPr>
                 <w:rStyle w:val="Hyperlink"/>
@@ -868,7 +871,7 @@
               <w:rPr>
                 <w:noProof/>
               </w:rPr>
-              <w:instrText xml:space="preserve"> PAGEREF _Toc240268388 \h </w:instrText>
+              <w:instrText xml:space="preserve"> PAGEREF _Toc240277886 \h </w:instrText>
             </w:r>
             <w:r>
               <w:rPr>
@@ -910,7 +913,7 @@
               <w14:ligatures w14:val="standardContextual"/>
             </w:rPr>
           </w:pPr>
-          <w:hyperlink w:anchor="_Toc240268389" w:history="1">
+          <w:hyperlink w:anchor="_Toc240277887" w:history="1">
             <w:r>
               <w:rPr>
                 <w:rStyle w:val="Hyperlink"/>
@@ -936,7 +939,7 @@
               <w:rPr>
                 <w:noProof/>
               </w:rPr>
-              <w:instrText xml:space="preserve"> PAGEREF _Toc240268389 \h </w:instrText>
+              <w:instrText xml:space="preserve"> PAGEREF _Toc240277887 \h </w:instrText>
             </w:r>
             <w:r>
               <w:rPr>
@@ -978,7 +981,7 @@
               <w14:ligatures w14:val="standardContextual"/>
             </w:rPr>
           </w:pPr>
-          <w:hyperlink w:anchor="_Toc240268390" w:history="1">
+          <w:hyperlink w:anchor="_Toc240277888" w:history="1">
             <w:r>
               <w:rPr>
                 <w:rStyle w:val="Hyperlink"/>
@@ -1004,7 +1007,7 @@
               <w:rPr>
                 <w:noProof/>
               </w:rPr>
-              <w:instrText xml:space="preserve"> PAGEREF _Toc240268390 \h </w:instrText>
+              <w:instrText xml:space="preserve"> PAGEREF _Toc240277888 \h </w:instrText>
             </w:r>
             <w:r>
               <w:rPr>
@@ -1046,7 +1049,7 @@
               <w14:ligatures w14:val="standardContextual"/>
             </w:rPr>
           </w:pPr>
-          <w:hyperlink w:anchor="_Toc240268391" w:history="1">
+          <w:hyperlink w:anchor="_Toc240277889" w:history="1">
             <w:r>
               <w:rPr>
                 <w:rStyle w:val="Hyperlink"/>
@@ -1072,7 +1075,7 @@
               <w:rPr>
                 <w:noProof/>
               </w:rPr>
-              <w:instrText xml:space="preserve"> PAGEREF _Toc240268391 \h </w:instrText>
+              <w:instrText xml:space="preserve"> PAGEREF _Toc240277889 \h </w:instrText>
             </w:r>
             <w:r>
               <w:rPr>
@@ -1114,7 +1117,7 @@
               <w14:ligatures w14:val="standardContextual"/>
             </w:rPr>
           </w:pPr>
-          <w:hyperlink w:anchor="_Toc240268392" w:history="1">
+          <w:hyperlink w:anchor="_Toc240277890" w:history="1">
             <w:r>
               <w:rPr>
                 <w:rStyle w:val="Hyperlink"/>
@@ -1140,7 +1143,7 @@
               <w:rPr>
                 <w:noProof/>
               </w:rPr>
-              <w:instrText xml:space="preserve"> PAGEREF _Toc240268392 \h </w:instrText>
+              <w:instrText xml:space="preserve"> PAGEREF _Toc240277890 \h </w:instrText>
             </w:r>
             <w:r>
               <w:rPr>
@@ -1182,7 +1185,7 @@
               <w14:ligatures w14:val="standardContextual"/>
             </w:rPr>
           </w:pPr>
-          <w:hyperlink w:anchor="_Toc240268393" w:history="1">
+          <w:hyperlink w:anchor="_Toc240277891" w:history="1">
             <w:r>
               <w:rPr>
                 <w:rStyle w:val="Hyperlink"/>
@@ -1208,7 +1211,7 @@
               <w:rPr>
                 <w:noProof/>
               </w:rPr>
-              <w:instrText xml:space="preserve"> PAGEREF _Toc240268393 \h </w:instrText>
+              <w:instrText xml:space="preserve"> PAGEREF _Toc240277891 \h </w:instrText>
             </w:r>
             <w:r>
               <w:rPr>
@@ -1250,7 +1253,7 @@
               <w14:ligatures w14:val="standardContextual"/>
             </w:rPr>
           </w:pPr>
-          <w:hyperlink w:anchor="_Toc240268394" w:history="1">
+          <w:hyperlink w:anchor="_Toc240277892" w:history="1">
             <w:r>
               <w:rPr>
                 <w:rStyle w:val="Hyperlink"/>
@@ -1276,7 +1279,7 @@
               <w:rPr>
                 <w:noProof/>
               </w:rPr>
-              <w:instrText xml:space="preserve"> PAGEREF _Toc240268394 \h </w:instrText>
+              <w:instrText xml:space="preserve"> PAGEREF _Toc240277892 \h </w:instrText>
             </w:r>
             <w:r>
               <w:rPr>
@@ -1318,7 +1321,7 @@
               <w14:ligatures w14:val="standardContextual"/>
             </w:rPr>
           </w:pPr>
-          <w:hyperlink w:anchor="_Toc240268395" w:history="1">
+          <w:hyperlink w:anchor="_Toc240277893" w:history="1">
             <w:r>
               <w:rPr>
                 <w:rStyle w:val="Hyperlink"/>
@@ -1344,7 +1347,7 @@
               <w:rPr>
                 <w:noProof/>
               </w:rPr>
-              <w:instrText xml:space="preserve"> PAGEREF _Toc240268395 \h </w:instrText>
+              <w:instrText xml:space="preserve"> PAGEREF _Toc240277893 \h </w:instrText>
             </w:r>
             <w:r>
               <w:rPr>
@@ -1386,7 +1389,7 @@
               <w14:ligatures w14:val="standardContextual"/>
             </w:rPr>
           </w:pPr>
-          <w:hyperlink w:anchor="_Toc240268396" w:history="1">
+          <w:hyperlink w:anchor="_Toc240277894" w:history="1">
             <w:r>
               <w:rPr>
                 <w:rStyle w:val="Hyperlink"/>
@@ -1412,7 +1415,7 @@
               <w:rPr>
                 <w:noProof/>
               </w:rPr>
-              <w:instrText xml:space="preserve"> PAGEREF _Toc240268396 \h </w:instrText>
+              <w:instrText xml:space="preserve"> PAGEREF _Toc240277894 \h </w:instrText>
             </w:r>
             <w:r>
               <w:rPr>
@@ -1454,7 +1457,7 @@
               <w14:ligatures w14:val="standardContextual"/>
             </w:rPr>
           </w:pPr>
-          <w:hyperlink w:anchor="_Toc240268397" w:history="1">
+          <w:hyperlink w:anchor="_Toc240277895" w:history="1">
             <w:r>
               <w:rPr>
                 <w:rStyle w:val="Hyperlink"/>
@@ -1480,7 +1483,7 @@
               <w:rPr>
                 <w:noProof/>
               </w:rPr>
-              <w:instrText xml:space="preserve"> PAGEREF _Toc240268397 \h </w:instrText>
+              <w:instrText xml:space="preserve"> PAGEREF _Toc240277895 \h </w:instrText>
             </w:r>
             <w:r>
               <w:rPr>
@@ -1522,7 +1525,7 @@
               <w14:ligatures w14:val="standardContextual"/>
             </w:rPr>
           </w:pPr>
-          <w:hyperlink w:anchor="_Toc240268398" w:history="1">
+          <w:hyperlink w:anchor="_Toc240277896" w:history="1">
             <w:r>
               <w:rPr>
                 <w:rStyle w:val="Hyperlink"/>
@@ -1548,7 +1551,7 @@
               <w:rPr>
                 <w:noProof/>
               </w:rPr>
-              <w:instrText xml:space="preserve"> PAGEREF _Toc240268398 \h </w:instrText>
+              <w:instrText xml:space="preserve"> PAGEREF _Toc240277896 \h </w:instrText>
             </w:r>
             <w:r>
               <w:rPr>
@@ -1590,7 +1593,7 @@
               <w14:ligatures w14:val="standardContextual"/>
             </w:rPr>
           </w:pPr>
-          <w:hyperlink w:anchor="_Toc240268399" w:history="1">
+          <w:hyperlink w:anchor="_Toc240277897" w:history="1">
             <w:r>
               <w:rPr>
                 <w:rStyle w:val="Hyperlink"/>
@@ -1616,7 +1619,7 @@
               <w:rPr>
                 <w:noProof/>
               </w:rPr>
-              <w:instrText xml:space="preserve"> PAGEREF _Toc240268399 \h </w:instrText>
+              <w:instrText xml:space="preserve"> PAGEREF _Toc240277897 \h </w:instrText>
             </w:r>
             <w:r>
               <w:rPr>
@@ -1658,7 +1661,7 @@
               <w14:ligatures w14:val="standardContextual"/>
             </w:rPr>
           </w:pPr>
-          <w:hyperlink w:anchor="_Toc240268400" w:history="1">
+          <w:hyperlink w:anchor="_Toc240277898" w:history="1">
             <w:r>
               <w:rPr>
                 <w:rStyle w:val="Hyperlink"/>
@@ -1684,7 +1687,7 @@
               <w:rPr>
                 <w:noProof/>
               </w:rPr>
-              <w:instrText xml:space="preserve"> PAGEREF _Toc240268400 \h </w:instrText>
+              <w:instrText xml:space="preserve"> PAGEREF _Toc240277898 \h </w:instrText>
             </w:r>
             <w:r>
               <w:rPr>
@@ -1726,7 +1729,7 @@
               <w14:ligatures w14:val="standardContextual"/>
             </w:rPr>
           </w:pPr>
-          <w:hyperlink w:anchor="_Toc240268401" w:history="1">
+          <w:hyperlink w:anchor="_Toc240277899" w:history="1">
             <w:r>
               <w:rPr>
                 <w:rStyle w:val="Hyperlink"/>
@@ -1752,7 +1755,7 @@
               <w:rPr>
                 <w:noProof/>
               </w:rPr>
-              <w:instrText xml:space="preserve"> PAGEREF _Toc240268401 \h </w:instrText>
+              <w:instrText xml:space="preserve"> PAGEREF _Toc240277899 \h </w:instrText>
             </w:r>
             <w:r>
               <w:rPr>
@@ -1794,7 +1797,7 @@
               <w14:ligatures w14:val="standardContextual"/>
             </w:rPr>
           </w:pPr>
-          <w:hyperlink w:anchor="_Toc240268402" w:history="1">
+          <w:hyperlink w:anchor="_Toc240277900" w:history="1">
             <w:r>
               <w:rPr>
                 <w:rStyle w:val="Hyperlink"/>
@@ -1820,7 +1823,7 @@
               <w:rPr>
                 <w:noProof/>
               </w:rPr>
-              <w:instrText xml:space="preserve"> PAGEREF _Toc240268402 \h </w:instrText>
+              <w:instrText xml:space="preserve"> PAGEREF _Toc240277900 \h </w:instrText>
             </w:r>
             <w:r>
               <w:rPr>
@@ -1862,7 +1865,7 @@
               <w14:ligatures w14:val="standardContextual"/>
             </w:rPr>
           </w:pPr>
-          <w:hyperlink w:anchor="_Toc240268403" w:history="1">
+          <w:hyperlink w:anchor="_Toc240277901" w:history="1">
             <w:r>
               <w:rPr>
                 <w:rStyle w:val="Hyperlink"/>
@@ -1888,7 +1891,7 @@
               <w:rPr>
                 <w:noProof/>
               </w:rPr>
-              <w:instrText xml:space="preserve"> PAGEREF _Toc240268403 \h </w:instrText>
+              <w:instrText xml:space="preserve"> PAGEREF _Toc240277901 \h </w:instrText>
             </w:r>
             <w:r>
               <w:rPr>
@@ -1930,7 +1933,7 @@
               <w14:ligatures w14:val="standardContextual"/>
             </w:rPr>
           </w:pPr>
-          <w:hyperlink w:anchor="_Toc240268404" w:history="1">
+          <w:hyperlink w:anchor="_Toc240277902" w:history="1">
             <w:r>
               <w:rPr>
                 <w:rStyle w:val="Hyperlink"/>
@@ -1956,7 +1959,7 @@
               <w:rPr>
                 <w:noProof/>
               </w:rPr>
-              <w:instrText xml:space="preserve"> PAGEREF _Toc240268404 \h </w:instrText>
+              <w:instrText xml:space="preserve"> PAGEREF _Toc240277902 \h </w:instrText>
             </w:r>
             <w:r>
               <w:rPr>
@@ -1998,7 +2001,7 @@
               <w14:ligatures w14:val="standardContextual"/>
             </w:rPr>
           </w:pPr>
-          <w:hyperlink w:anchor="_Toc240268405" w:history="1">
+          <w:hyperlink w:anchor="_Toc240277903" w:history="1">
             <w:r>
               <w:rPr>
                 <w:rStyle w:val="Hyperlink"/>
@@ -2024,7 +2027,7 @@
               <w:rPr>
                 <w:noProof/>
               </w:rPr>
-              <w:instrText xml:space="preserve"> PAGEREF _Toc240268405 \h </w:instrText>
+              <w:instrText xml:space="preserve"> PAGEREF _Toc240277903 \h </w:instrText>
             </w:r>
             <w:r>
               <w:rPr>
@@ -2066,7 +2069,7 @@
               <w14:ligatures w14:val="standardContextual"/>
             </w:rPr>
           </w:pPr>
-          <w:hyperlink w:anchor="_Toc240268406" w:history="1">
+          <w:hyperlink w:anchor="_Toc240277904" w:history="1">
             <w:r>
               <w:rPr>
                 <w:rStyle w:val="Hyperlink"/>
@@ -2092,7 +2095,7 @@
               <w:rPr>
                 <w:noProof/>
               </w:rPr>
-              <w:instrText xml:space="preserve"> PAGEREF _Toc240268406 \h </w:instrText>
+              <w:instrText xml:space="preserve"> PAGEREF _Toc240277904 \h </w:instrText>
             </w:r>
             <w:r>
               <w:rPr>
@@ -2134,7 +2137,7 @@
               <w14:ligatures w14:val="standardContextual"/>
             </w:rPr>
           </w:pPr>
-          <w:hyperlink w:anchor="_Toc240268407" w:history="1">
+          <w:hyperlink w:anchor="_Toc240277905" w:history="1">
             <w:r>
               <w:rPr>
                 <w:rStyle w:val="Hyperlink"/>
@@ -2160,7 +2163,7 @@
               <w:rPr>
                 <w:noProof/>
               </w:rPr>
-              <w:instrText xml:space="preserve"> PAGEREF _Toc240268407 \h </w:instrText>
+              <w:instrText xml:space="preserve"> PAGEREF _Toc240277905 \h </w:instrText>
             </w:r>
             <w:r>
               <w:rPr>
@@ -2202,7 +2205,7 @@
               <w14:ligatures w14:val="standardContextual"/>
             </w:rPr>
           </w:pPr>
-          <w:hyperlink w:anchor="_Toc240268408" w:history="1">
+          <w:hyperlink w:anchor="_Toc240277906" w:history="1">
             <w:r>
               <w:rPr>
                 <w:rStyle w:val="Hyperlink"/>
@@ -2228,7 +2231,7 @@
               <w:rPr>
                 <w:noProof/>
               </w:rPr>
-              <w:instrText xml:space="preserve"> PAGEREF _Toc240268408 \h </w:instrText>
+              <w:instrText xml:space="preserve"> PAGEREF _Toc240277906 \h </w:instrText>
             </w:r>
             <w:r>
               <w:rPr>
@@ -2270,7 +2273,7 @@
               <w14:ligatures w14:val="standardContextual"/>
             </w:rPr>
           </w:pPr>
-          <w:hyperlink w:anchor="_Toc240268409" w:history="1">
+          <w:hyperlink w:anchor="_Toc240277907" w:history="1">
             <w:r>
               <w:rPr>
                 <w:rStyle w:val="Hyperlink"/>
@@ -2296,7 +2299,7 @@
               <w:rPr>
                 <w:noProof/>
               </w:rPr>
-              <w:instrText xml:space="preserve"> PAGEREF _Toc240268409 \h </w:instrText>
+              <w:instrText xml:space="preserve"> PAGEREF _Toc240277907 \h </w:instrText>
             </w:r>
             <w:r>
               <w:rPr>
@@ -2338,7 +2341,7 @@
               <w14:ligatures w14:val="standardContextual"/>
             </w:rPr>
           </w:pPr>
-          <w:hyperlink w:anchor="_Toc240268410" w:history="1">
+          <w:hyperlink w:anchor="_Toc240277908" w:history="1">
             <w:r>
               <w:rPr>
                 <w:rStyle w:val="Hyperlink"/>
@@ -2364,7 +2367,7 @@
               <w:rPr>
                 <w:noProof/>
               </w:rPr>
-              <w:instrText xml:space="preserve"> PAGEREF _Toc240268410 \h </w:instrText>
+              <w:instrText xml:space="preserve"> PAGEREF _Toc240277908 \h </w:instrText>
             </w:r>
             <w:r>
               <w:rPr>
@@ -2406,7 +2409,7 @@
               <w14:ligatures w14:val="standardContextual"/>
             </w:rPr>
           </w:pPr>
-          <w:hyperlink w:anchor="_Toc240268411" w:history="1">
+          <w:hyperlink w:anchor="_Toc240277909" w:history="1">
             <w:r>
               <w:rPr>
                 <w:rStyle w:val="Hyperlink"/>
@@ -2432,7 +2435,7 @@
               <w:rPr>
                 <w:noProof/>
               </w:rPr>
-              <w:instrText xml:space="preserve"> PAGEREF _Toc240268411 \h </w:instrText>
+              <w:instrText xml:space="preserve"> PAGEREF _Toc240277909 \h </w:instrText>
             </w:r>
             <w:r>
               <w:rPr>
@@ -2474,7 +2477,7 @@
               <w14:ligatures w14:val="standardContextual"/>
             </w:rPr>
           </w:pPr>
-          <w:hyperlink w:anchor="_Toc240268412" w:history="1">
+          <w:hyperlink w:anchor="_Toc240277910" w:history="1">
             <w:r>
               <w:rPr>
                 <w:rStyle w:val="Hyperlink"/>
@@ -2500,7 +2503,7 @@
               <w:rPr>
                 <w:noProof/>
               </w:rPr>
-              <w:instrText xml:space="preserve"> PAGEREF _Toc240268412 \h </w:instrText>
+              <w:instrText xml:space="preserve"> PAGEREF _Toc240277910 \h </w:instrText>
             </w:r>
             <w:r>
               <w:rPr>
@@ -2542,7 +2545,7 @@
               <w14:ligatures w14:val="standardContextual"/>
             </w:rPr>
           </w:pPr>
-          <w:hyperlink w:anchor="_Toc240268413" w:history="1">
+          <w:hyperlink w:anchor="_Toc240277911" w:history="1">
             <w:r>
               <w:rPr>
                 <w:rStyle w:val="Hyperlink"/>
@@ -2568,7 +2571,7 @@
               <w:rPr>
                 <w:noProof/>
               </w:rPr>
-              <w:instrText xml:space="preserve"> PAGEREF _Toc240268413 \h </w:instrText>
+              <w:instrText xml:space="preserve"> PAGEREF _Toc240277911 \h </w:instrText>
             </w:r>
             <w:r>
               <w:rPr>
@@ -2610,7 +2613,7 @@
               <w14:ligatures w14:val="standardContextual"/>
             </w:rPr>
           </w:pPr>
-          <w:hyperlink w:anchor="_Toc240268414" w:history="1">
+          <w:hyperlink w:anchor="_Toc240277912" w:history="1">
             <w:r>
               <w:rPr>
                 <w:rStyle w:val="Hyperlink"/>
@@ -2636,7 +2639,7 @@
               <w:rPr>
                 <w:noProof/>
               </w:rPr>
-              <w:instrText xml:space="preserve"> PAGEREF _Toc240268414 \h </w:instrText>
+              <w:instrText xml:space="preserve"> PAGEREF _Toc240277912 \h </w:instrText>
             </w:r>
             <w:r>
               <w:rPr>
@@ -2678,7 +2681,7 @@
               <w14:ligatures w14:val="standardContextual"/>
             </w:rPr>
           </w:pPr>
-          <w:hyperlink w:anchor="_Toc240268415" w:history="1">
+          <w:hyperlink w:anchor="_Toc240277913" w:history="1">
             <w:r>
               <w:rPr>
                 <w:rStyle w:val="Hyperlink"/>
@@ -2704,7 +2707,7 @@
               <w:rPr>
                 <w:noProof/>
               </w:rPr>
-              <w:instrText xml:space="preserve"> PAGEREF _Toc240268415 \h </w:instrText>
+              <w:instrText xml:space="preserve"> PAGEREF _Toc240277913 \h </w:instrText>
             </w:r>
             <w:r>
               <w:rPr>
@@ -2746,7 +2749,7 @@
               <w14:ligatures w14:val="standardContextual"/>
             </w:rPr>
           </w:pPr>
-          <w:hyperlink w:anchor="_Toc240268416" w:history="1">
+          <w:hyperlink w:anchor="_Toc240277914" w:history="1">
             <w:r>
               <w:rPr>
                 <w:rStyle w:val="Hyperlink"/>
@@ -2772,7 +2775,7 @@
               <w:rPr>
                 <w:noProof/>
               </w:rPr>
-              <w:instrText xml:space="preserve"> PAGEREF _Toc240268416 \h </w:instrText>
+              <w:instrText xml:space="preserve"> PAGEREF _Toc240277914 \h </w:instrText>
             </w:r>
             <w:r>
               <w:rPr>
@@ -2814,7 +2817,7 @@
               <w14:ligatures w14:val="standardContextual"/>
             </w:rPr>
           </w:pPr>
-          <w:hyperlink w:anchor="_Toc240268417" w:history="1">
+          <w:hyperlink w:anchor="_Toc240277915" w:history="1">
             <w:r>
               <w:rPr>
                 <w:rStyle w:val="Hyperlink"/>
@@ -2840,7 +2843,7 @@
               <w:rPr>
                 <w:noProof/>
               </w:rPr>
-              <w:instrText xml:space="preserve"> PAGEREF _Toc240268417 \h </w:instrText>
+              <w:instrText xml:space="preserve"> PAGEREF _Toc240277915 \h </w:instrText>
             </w:r>
             <w:r>
               <w:rPr>
@@ -2882,7 +2885,7 @@
               <w14:ligatures w14:val="standardContextual"/>
             </w:rPr>
           </w:pPr>
-          <w:hyperlink w:anchor="_Toc240268418" w:history="1">
+          <w:hyperlink w:anchor="_Toc240277916" w:history="1">
             <w:r>
               <w:rPr>
                 <w:rStyle w:val="Hyperlink"/>
@@ -2908,7 +2911,7 @@
               <w:rPr>
                 <w:noProof/>
               </w:rPr>
-              <w:instrText xml:space="preserve"> PAGEREF _Toc240268418 \h </w:instrText>
+              <w:instrText xml:space="preserve"> PAGEREF _Toc240277916 \h </w:instrText>
             </w:r>
             <w:r>
               <w:rPr>
@@ -2950,7 +2953,7 @@
               <w14:ligatures w14:val="standardContextual"/>
             </w:rPr>
           </w:pPr>
-          <w:hyperlink w:anchor="_Toc240268419" w:history="1">
+          <w:hyperlink w:anchor="_Toc240277917" w:history="1">
             <w:r>
               <w:rPr>
                 <w:rStyle w:val="Hyperlink"/>
@@ -2976,7 +2979,7 @@
               <w:rPr>
                 <w:noProof/>
               </w:rPr>
-              <w:instrText xml:space="preserve"> PAGEREF _Toc240268419 \h </w:instrText>
+              <w:instrText xml:space="preserve"> PAGEREF _Toc240277917 \h </w:instrText>
             </w:r>
             <w:r>
               <w:rPr>
@@ -3018,7 +3021,7 @@
               <w14:ligatures w14:val="standardContextual"/>
             </w:rPr>
           </w:pPr>
-          <w:hyperlink w:anchor="_Toc240268420" w:history="1">
+          <w:hyperlink w:anchor="_Toc240277918" w:history="1">
             <w:r>
               <w:rPr>
                 <w:rStyle w:val="Hyperlink"/>
@@ -3044,7 +3047,7 @@
               <w:rPr>
                 <w:noProof/>
               </w:rPr>
-              <w:instrText xml:space="preserve"> PAGEREF _Toc240268420 \h </w:instrText>
+              <w:instrText xml:space="preserve"> PAGEREF _Toc240277918 \h </w:instrText>
             </w:r>
             <w:r>
               <w:rPr>
@@ -3086,7 +3089,7 @@
               <w14:ligatures w14:val="standardContextual"/>
             </w:rPr>
           </w:pPr>
-          <w:hyperlink w:anchor="_Toc240268421" w:history="1">
+          <w:hyperlink w:anchor="_Toc240277919" w:history="1">
             <w:r>
               <w:rPr>
                 <w:rStyle w:val="Hyperlink"/>
@@ -3112,7 +3115,7 @@
               <w:rPr>
                 <w:noProof/>
               </w:rPr>
-              <w:instrText xml:space="preserve"> PAGEREF _Toc240268421 \h </w:instrText>
+              <w:instrText xml:space="preserve"> PAGEREF _Toc240277919 \h </w:instrText>
             </w:r>
             <w:r>
               <w:rPr>
@@ -3154,7 +3157,7 @@
               <w14:ligatures w14:val="standardContextual"/>
             </w:rPr>
           </w:pPr>
-          <w:hyperlink w:anchor="_Toc240268422" w:history="1">
+          <w:hyperlink w:anchor="_Toc240277920" w:history="1">
             <w:r>
               <w:rPr>
                 <w:rStyle w:val="Hyperlink"/>
@@ -3180,7 +3183,7 @@
               <w:rPr>
                 <w:noProof/>
               </w:rPr>
-              <w:instrText xml:space="preserve"> PAGEREF _Toc240268422 \h </w:instrText>
+              <w:instrText xml:space="preserve"> PAGEREF _Toc240277920 \h </w:instrText>
             </w:r>
             <w:r>
               <w:rPr>
@@ -3222,7 +3225,7 @@
               <w14:ligatures w14:val="standardContextual"/>
             </w:rPr>
           </w:pPr>
-          <w:hyperlink w:anchor="_Toc240268423" w:history="1">
+          <w:hyperlink w:anchor="_Toc240277921" w:history="1">
             <w:r>
               <w:rPr>
                 <w:rStyle w:val="Hyperlink"/>
@@ -3248,7 +3251,7 @@
               <w:rPr>
                 <w:noProof/>
               </w:rPr>
-              <w:instrText xml:space="preserve"> PAGEREF _Toc240268423 \h </w:instrText>
+              <w:instrText xml:space="preserve"> PAGEREF _Toc240277921 \h </w:instrText>
             </w:r>
             <w:r>
               <w:rPr>
@@ -3290,7 +3293,7 @@
               <w14:ligatures w14:val="standardContextual"/>
             </w:rPr>
           </w:pPr>
-          <w:hyperlink w:anchor="_Toc240268424" w:history="1">
+          <w:hyperlink w:anchor="_Toc240277922" w:history="1">
             <w:r>
               <w:rPr>
                 <w:rStyle w:val="Hyperlink"/>
@@ -3316,7 +3319,7 @@
               <w:rPr>
                 <w:noProof/>
               </w:rPr>
-              <w:instrText xml:space="preserve"> PAGEREF _Toc240268424 \h </w:instrText>
+              <w:instrText xml:space="preserve"> PAGEREF _Toc240277922 \h </w:instrText>
             </w:r>
             <w:r>
               <w:rPr>
@@ -3358,7 +3361,7 @@
               <w14:ligatures w14:val="standardContextual"/>
             </w:rPr>
           </w:pPr>
-          <w:hyperlink w:anchor="_Toc240268425" w:history="1">
+          <w:hyperlink w:anchor="_Toc240277923" w:history="1">
             <w:r>
               <w:rPr>
                 <w:rStyle w:val="Hyperlink"/>
@@ -3384,7 +3387,7 @@
               <w:rPr>
                 <w:noProof/>
               </w:rPr>
-              <w:instrText xml:space="preserve"> PAGEREF _Toc240268425 \h </w:instrText>
+              <w:instrText xml:space="preserve"> PAGEREF _Toc240277923 \h </w:instrText>
             </w:r>
             <w:r>
               <w:rPr>
@@ -3426,7 +3429,7 @@
               <w14:ligatures w14:val="standardContextual"/>
             </w:rPr>
           </w:pPr>
-          <w:hyperlink w:anchor="_Toc240268426" w:history="1">
+          <w:hyperlink w:anchor="_Toc240277924" w:history="1">
             <w:r>
               <w:rPr>
                 <w:rStyle w:val="Hyperlink"/>
@@ -3452,7 +3455,7 @@
               <w:rPr>
                 <w:noProof/>
               </w:rPr>
-              <w:instrText xml:space="preserve"> PAGEREF _Toc240268426 \h </w:instrText>
+              <w:instrText xml:space="preserve"> PAGEREF _Toc240277924 \h </w:instrText>
             </w:r>
             <w:r>
               <w:rPr>
@@ -3494,7 +3497,7 @@
               <w14:ligatures w14:val="standardContextual"/>
             </w:rPr>
           </w:pPr>
-          <w:hyperlink w:anchor="_Toc240268427" w:history="1">
+          <w:hyperlink w:anchor="_Toc240277925" w:history="1">
             <w:r>
               <w:rPr>
                 <w:rStyle w:val="Hyperlink"/>
@@ -3520,7 +3523,7 @@
               <w:rPr>
                 <w:noProof/>
               </w:rPr>
-              <w:instrText xml:space="preserve"> PAGEREF _Toc240268427 \h </w:instrText>
+              <w:instrText xml:space="preserve"> PAGEREF _Toc240277925 \h </w:instrText>
             </w:r>
             <w:r>
               <w:rPr>
@@ -3562,7 +3565,7 @@
               <w14:ligatures w14:val="standardContextual"/>
             </w:rPr>
           </w:pPr>
-          <w:hyperlink w:anchor="_Toc240268428" w:history="1">
+          <w:hyperlink w:anchor="_Toc240277926" w:history="1">
             <w:r>
               <w:rPr>
                 <w:rStyle w:val="Hyperlink"/>
@@ -3588,7 +3591,7 @@
               <w:rPr>
                 <w:noProof/>
               </w:rPr>
-              <w:instrText xml:space="preserve"> PAGEREF _Toc240268428 \h </w:instrText>
+              <w:instrText xml:space="preserve"> PAGEREF _Toc240277926 \h </w:instrText>
             </w:r>
             <w:r>
               <w:rPr>
@@ -3630,7 +3633,7 @@
               <w14:ligatures w14:val="standardContextual"/>
             </w:rPr>
           </w:pPr>
-          <w:hyperlink w:anchor="_Toc240268429" w:history="1">
+          <w:hyperlink w:anchor="_Toc240277927" w:history="1">
             <w:r>
               <w:rPr>
                 <w:rStyle w:val="Hyperlink"/>
@@ -3656,7 +3659,7 @@
               <w:rPr>
                 <w:noProof/>
               </w:rPr>
-              <w:instrText xml:space="preserve"> PAGEREF _Toc240268429 \h </w:instrText>
+              <w:instrText xml:space="preserve"> PAGEREF _Toc240277927 \h </w:instrText>
             </w:r>
             <w:r>
               <w:rPr>
@@ -3698,7 +3701,7 @@
               <w14:ligatures w14:val="standardContextual"/>
             </w:rPr>
           </w:pPr>
-          <w:hyperlink w:anchor="_Toc240268430" w:history="1">
+          <w:hyperlink w:anchor="_Toc240277928" w:history="1">
             <w:r>
               <w:rPr>
                 <w:rStyle w:val="Hyperlink"/>
@@ -3724,7 +3727,7 @@
               <w:rPr>
                 <w:noProof/>
               </w:rPr>
-              <w:instrText xml:space="preserve"> PAGEREF _Toc240268430 \h </w:instrText>
+              <w:instrText xml:space="preserve"> PAGEREF _Toc240277928 \h </w:instrText>
             </w:r>
             <w:r>
               <w:rPr>
@@ -3766,7 +3769,7 @@
               <w14:ligatures w14:val="standardContextual"/>
             </w:rPr>
           </w:pPr>
-          <w:hyperlink w:anchor="_Toc240268431" w:history="1">
+          <w:hyperlink w:anchor="_Toc240277929" w:history="1">
             <w:r>
               <w:rPr>
                 <w:rStyle w:val="Hyperlink"/>
@@ -3792,7 +3795,7 @@
               <w:rPr>
                 <w:noProof/>
               </w:rPr>
-              <w:instrText xml:space="preserve"> PAGEREF _Toc240268431 \h </w:instrText>
+              <w:instrText xml:space="preserve"> PAGEREF _Toc240277929 \h </w:instrText>
             </w:r>
             <w:r>
               <w:rPr>
@@ -3834,7 +3837,7 @@
               <w14:ligatures w14:val="standardContextual"/>
             </w:rPr>
           </w:pPr>
-          <w:hyperlink w:anchor="_Toc240268432" w:history="1">
+          <w:hyperlink w:anchor="_Toc240277930" w:history="1">
             <w:r>
               <w:rPr>
                 <w:rStyle w:val="Hyperlink"/>
@@ -3860,7 +3863,7 @@
               <w:rPr>
                 <w:noProof/>
               </w:rPr>
-              <w:instrText xml:space="preserve"> PAGEREF _Toc240268432 \h </w:instrText>
+              <w:instrText xml:space="preserve"> PAGEREF _Toc240277930 \h </w:instrText>
             </w:r>
             <w:r>
               <w:rPr>
@@ -3902,7 +3905,7 @@
               <w14:ligatures w14:val="standardContextual"/>
             </w:rPr>
           </w:pPr>
-          <w:hyperlink w:anchor="_Toc240268433" w:history="1">
+          <w:hyperlink w:anchor="_Toc240277931" w:history="1">
             <w:r>
               <w:rPr>
                 <w:rStyle w:val="Hyperlink"/>
@@ -3928,7 +3931,7 @@
               <w:rPr>
                 <w:noProof/>
               </w:rPr>
-              <w:instrText xml:space="preserve"> PAGEREF _Toc240268433 \h </w:instrText>
+              <w:instrText xml:space="preserve"> PAGEREF _Toc240277931 \h </w:instrText>
             </w:r>
             <w:r>
               <w:rPr>
@@ -3970,7 +3973,7 @@
               <w14:ligatures w14:val="standardContextual"/>
             </w:rPr>
           </w:pPr>
-          <w:hyperlink w:anchor="_Toc240268434" w:history="1">
+          <w:hyperlink w:anchor="_Toc240277932" w:history="1">
             <w:r>
               <w:rPr>
                 <w:rStyle w:val="Hyperlink"/>
@@ -3996,7 +3999,7 @@
               <w:rPr>
                 <w:noProof/>
               </w:rPr>
-              <w:instrText xml:space="preserve"> PAGEREF _Toc240268434 \h </w:instrText>
+              <w:instrText xml:space="preserve"> PAGEREF _Toc240277932 \h </w:instrText>
             </w:r>
             <w:r>
               <w:rPr>
@@ -4038,7 +4041,7 @@
               <w14:ligatures w14:val="standardContextual"/>
             </w:rPr>
           </w:pPr>
-          <w:hyperlink w:anchor="_Toc240268435" w:history="1">
+          <w:hyperlink w:anchor="_Toc240277933" w:history="1">
             <w:r>
               <w:rPr>
                 <w:rStyle w:val="Hyperlink"/>
@@ -4064,7 +4067,7 @@
               <w:rPr>
                 <w:noProof/>
               </w:rPr>
-              <w:instrText xml:space="preserve"> PAGEREF _Toc240268435 \h </w:instrText>
+              <w:instrText xml:space="preserve"> PAGEREF _Toc240277933 \h </w:instrText>
             </w:r>
             <w:r>
               <w:rPr>
@@ -4106,7 +4109,7 @@
               <w14:ligatures w14:val="standardContextual"/>
             </w:rPr>
           </w:pPr>
-          <w:hyperlink w:anchor="_Toc240268436" w:history="1">
+          <w:hyperlink w:anchor="_Toc240277934" w:history="1">
             <w:r>
               <w:rPr>
                 <w:rStyle w:val="Hyperlink"/>
@@ -4132,7 +4135,7 @@
               <w:rPr>
                 <w:noProof/>
               </w:rPr>
-              <w:instrText xml:space="preserve"> PAGEREF _Toc240268436 \h </w:instrText>
+              <w:instrText xml:space="preserve"> PAGEREF _Toc240277934 \h </w:instrText>
             </w:r>
             <w:r>
               <w:rPr>
@@ -4174,7 +4177,7 @@
               <w14:ligatures w14:val="standardContextual"/>
             </w:rPr>
           </w:pPr>
-          <w:hyperlink w:anchor="_Toc240268437" w:history="1">
+          <w:hyperlink w:anchor="_Toc240277935" w:history="1">
             <w:r>
               <w:rPr>
                 <w:rStyle w:val="Hyperlink"/>
@@ -4200,7 +4203,7 @@
               <w:rPr>
                 <w:noProof/>
               </w:rPr>
-              <w:instrText xml:space="preserve"> PAGEREF _Toc240268437 \h </w:instrText>
+              <w:instrText xml:space="preserve"> PAGEREF _Toc240277935 \h </w:instrText>
             </w:r>
             <w:r>
               <w:rPr>
@@ -4242,7 +4245,7 @@
               <w14:ligatures w14:val="standardContextual"/>
             </w:rPr>
           </w:pPr>
-          <w:hyperlink w:anchor="_Toc240268438" w:history="1">
+          <w:hyperlink w:anchor="_Toc240277936" w:history="1">
             <w:r>
               <w:rPr>
                 <w:rStyle w:val="Hyperlink"/>
@@ -4268,7 +4271,7 @@
               <w:rPr>
                 <w:noProof/>
               </w:rPr>
-              <w:instrText xml:space="preserve"> PAGEREF _Toc240268438 \h </w:instrText>
+              <w:instrText xml:space="preserve"> PAGEREF _Toc240277936 \h </w:instrText>
             </w:r>
             <w:r>
               <w:rPr>
@@ -4310,7 +4313,7 @@
               <w14:ligatures w14:val="standardContextual"/>
             </w:rPr>
           </w:pPr>
-          <w:hyperlink w:anchor="_Toc240268439" w:history="1">
+          <w:hyperlink w:anchor="_Toc240277937" w:history="1">
             <w:r>
               <w:rPr>
                 <w:rStyle w:val="Hyperlink"/>
@@ -4336,7 +4339,7 @@
               <w:rPr>
                 <w:noProof/>
               </w:rPr>
-              <w:instrText xml:space="preserve"> PAGEREF _Toc240268439 \h </w:instrText>
+              <w:instrText xml:space="preserve"> PAGEREF _Toc240277937 \h </w:instrText>
             </w:r>
             <w:r>
               <w:rPr>
@@ -4378,7 +4381,7 @@
               <w14:ligatures w14:val="standardContextual"/>
             </w:rPr>
           </w:pPr>
-          <w:hyperlink w:anchor="_Toc240268440" w:history="1">
+          <w:hyperlink w:anchor="_Toc240277938" w:history="1">
             <w:r>
               <w:rPr>
                 <w:rStyle w:val="Hyperlink"/>
@@ -4404,7 +4407,7 @@
               <w:rPr>
                 <w:noProof/>
               </w:rPr>
-              <w:instrText xml:space="preserve"> PAGEREF _Toc240268440 \h </w:instrText>
+              <w:instrText xml:space="preserve"> PAGEREF _Toc240277938 \h </w:instrText>
             </w:r>
             <w:r>
               <w:rPr>
@@ -4446,7 +4449,7 @@
               <w14:ligatures w14:val="standardContextual"/>
             </w:rPr>
           </w:pPr>
-          <w:hyperlink w:anchor="_Toc240268441" w:history="1">
+          <w:hyperlink w:anchor="_Toc240277939" w:history="1">
             <w:r>
               <w:rPr>
                 <w:rStyle w:val="Hyperlink"/>
@@ -4472,7 +4475,7 @@
               <w:rPr>
                 <w:noProof/>
               </w:rPr>
-              <w:instrText xml:space="preserve"> PAGEREF _Toc240268441 \h </w:instrText>
+              <w:instrText xml:space="preserve"> PAGEREF _Toc240277939 \h </w:instrText>
             </w:r>
             <w:r>
               <w:rPr>
@@ -4514,7 +4517,7 @@
               <w14:ligatures w14:val="standardContextual"/>
             </w:rPr>
           </w:pPr>
-          <w:hyperlink w:anchor="_Toc240268442" w:history="1">
+          <w:hyperlink w:anchor="_Toc240277940" w:history="1">
             <w:r>
               <w:rPr>
                 <w:rStyle w:val="Hyperlink"/>
@@ -4540,7 +4543,7 @@
               <w:rPr>
                 <w:noProof/>
               </w:rPr>
-              <w:instrText xml:space="preserve"> PAGEREF _Toc240268442 \h </w:instrText>
+              <w:instrText xml:space="preserve"> PAGEREF _Toc240277940 \h </w:instrText>
             </w:r>
             <w:r>
               <w:rPr>
@@ -4582,7 +4585,7 @@
               <w14:ligatures w14:val="standardContextual"/>
             </w:rPr>
           </w:pPr>
-          <w:hyperlink w:anchor="_Toc240268443" w:history="1">
+          <w:hyperlink w:anchor="_Toc240277941" w:history="1">
             <w:r>
               <w:rPr>
                 <w:rStyle w:val="Hyperlink"/>
@@ -4608,7 +4611,7 @@
               <w:rPr>
                 <w:noProof/>
               </w:rPr>
-              <w:instrText xml:space="preserve"> PAGEREF _Toc240268443 \h </w:instrText>
+              <w:instrText xml:space="preserve"> PAGEREF _Toc240277941 \h </w:instrText>
             </w:r>
             <w:r>
               <w:rPr>
@@ -4650,7 +4653,7 @@
               <w14:ligatures w14:val="standardContextual"/>
             </w:rPr>
           </w:pPr>
-          <w:hyperlink w:anchor="_Toc240268444" w:history="1">
+          <w:hyperlink w:anchor="_Toc240277942" w:history="1">
             <w:r>
               <w:rPr>
                 <w:rStyle w:val="Hyperlink"/>
@@ -4676,7 +4679,7 @@
               <w:rPr>
                 <w:noProof/>
               </w:rPr>
-              <w:instrText xml:space="preserve"> PAGEREF _Toc240268444 \h </w:instrText>
+              <w:instrText xml:space="preserve"> PAGEREF _Toc240277942 \h </w:instrText>
             </w:r>
             <w:r>
               <w:rPr>
@@ -4718,7 +4721,7 @@
               <w14:ligatures w14:val="standardContextual"/>
             </w:rPr>
           </w:pPr>
-          <w:hyperlink w:anchor="_Toc240268445" w:history="1">
+          <w:hyperlink w:anchor="_Toc240277943" w:history="1">
             <w:r>
               <w:rPr>
                 <w:rStyle w:val="Hyperlink"/>
@@ -4744,7 +4747,7 @@
               <w:rPr>
                 <w:noProof/>
               </w:rPr>
-              <w:instrText xml:space="preserve"> PAGEREF _Toc240268445 \h </w:instrText>
+              <w:instrText xml:space="preserve"> PAGEREF _Toc240277943 \h </w:instrText>
             </w:r>
             <w:r>
               <w:rPr>
@@ -4786,7 +4789,7 @@
               <w14:ligatures w14:val="standardContextual"/>
             </w:rPr>
           </w:pPr>
-          <w:hyperlink w:anchor="_Toc240268446" w:history="1">
+          <w:hyperlink w:anchor="_Toc240277944" w:history="1">
             <w:r>
               <w:rPr>
                 <w:rStyle w:val="Hyperlink"/>
@@ -4812,7 +4815,7 @@
               <w:rPr>
                 <w:noProof/>
               </w:rPr>
-              <w:instrText xml:space="preserve"> PAGEREF _Toc240268446 \h </w:instrText>
+              <w:instrText xml:space="preserve"> PAGEREF _Toc240277944 \h </w:instrText>
             </w:r>
             <w:r>
               <w:rPr>
@@ -4854,7 +4857,7 @@
               <w14:ligatures w14:val="standardContextual"/>
             </w:rPr>
           </w:pPr>
-          <w:hyperlink w:anchor="_Toc240268447" w:history="1">
+          <w:hyperlink w:anchor="_Toc240277945" w:history="1">
             <w:r>
               <w:rPr>
                 <w:rStyle w:val="Hyperlink"/>
@@ -4880,7 +4883,7 @@
               <w:rPr>
                 <w:noProof/>
               </w:rPr>
-              <w:instrText xml:space="preserve"> PAGEREF _Toc240268447 \h </w:instrText>
+              <w:instrText xml:space="preserve"> PAGEREF _Toc240277945 \h </w:instrText>
             </w:r>
             <w:r>
               <w:rPr>
@@ -4922,7 +4925,7 @@
               <w14:ligatures w14:val="standardContextual"/>
             </w:rPr>
           </w:pPr>
-          <w:hyperlink w:anchor="_Toc240268448" w:history="1">
+          <w:hyperlink w:anchor="_Toc240277946" w:history="1">
             <w:r>
               <w:rPr>
                 <w:rStyle w:val="Hyperlink"/>
@@ -4948,7 +4951,7 @@
               <w:rPr>
                 <w:noProof/>
               </w:rPr>
-              <w:instrText xml:space="preserve"> PAGEREF _Toc240268448 \h </w:instrText>
+              <w:instrText xml:space="preserve"> PAGEREF _Toc240277946 \h </w:instrText>
             </w:r>
             <w:r>
               <w:rPr>
@@ -4990,7 +4993,7 @@
               <w14:ligatures w14:val="standardContextual"/>
             </w:rPr>
           </w:pPr>
-          <w:hyperlink w:anchor="_Toc240268449" w:history="1">
+          <w:hyperlink w:anchor="_Toc240277947" w:history="1">
             <w:r>
               <w:rPr>
                 <w:rStyle w:val="Hyperlink"/>
@@ -5016,7 +5019,7 @@
               <w:rPr>
                 <w:noProof/>
               </w:rPr>
-              <w:instrText xml:space="preserve"> PAGEREF _Toc240268449 \h </w:instrText>
+              <w:instrText xml:space="preserve"> PAGEREF _Toc240277947 \h </w:instrText>
             </w:r>
             <w:r>
               <w:rPr>
@@ -5058,7 +5061,7 @@
               <w14:ligatures w14:val="standardContextual"/>
             </w:rPr>
           </w:pPr>
-          <w:hyperlink w:anchor="_Toc240268450" w:history="1">
+          <w:hyperlink w:anchor="_Toc240277948" w:history="1">
             <w:r>
               <w:rPr>
                 <w:rStyle w:val="Hyperlink"/>
@@ -5084,7 +5087,7 @@
               <w:rPr>
                 <w:noProof/>
               </w:rPr>
-              <w:instrText xml:space="preserve"> PAGEREF _Toc240268450 \h </w:instrText>
+              <w:instrText xml:space="preserve"> PAGEREF _Toc240277948 \h </w:instrText>
             </w:r>
             <w:r>
               <w:rPr>
@@ -5126,7 +5129,7 @@
               <w14:ligatures w14:val="standardContextual"/>
             </w:rPr>
           </w:pPr>
-          <w:hyperlink w:anchor="_Toc240268451" w:history="1">
+          <w:hyperlink w:anchor="_Toc240277949" w:history="1">
             <w:r>
               <w:rPr>
                 <w:rStyle w:val="Hyperlink"/>
@@ -5152,7 +5155,7 @@
               <w:rPr>
                 <w:noProof/>
               </w:rPr>
-              <w:instrText xml:space="preserve"> PAGEREF _Toc240268451 \h </w:instrText>
+              <w:instrText xml:space="preserve"> PAGEREF _Toc240277949 \h </w:instrText>
             </w:r>
             <w:r>
               <w:rPr>
@@ -5194,7 +5197,7 @@
               <w14:ligatures w14:val="standardContextual"/>
             </w:rPr>
           </w:pPr>
-          <w:hyperlink w:anchor="_Toc240268452" w:history="1">
+          <w:hyperlink w:anchor="_Toc240277950" w:history="1">
             <w:r>
               <w:rPr>
                 <w:rStyle w:val="Hyperlink"/>
@@ -5220,7 +5223,7 @@
               <w:rPr>
                 <w:noProof/>
               </w:rPr>
-              <w:instrText xml:space="preserve"> PAGEREF _Toc240268452 \h </w:instrText>
+              <w:instrText xml:space="preserve"> PAGEREF _Toc240277950 \h </w:instrText>
             </w:r>
             <w:r>
               <w:rPr>
@@ -5262,7 +5265,7 @@
               <w14:ligatures w14:val="standardContextual"/>
             </w:rPr>
           </w:pPr>
-          <w:hyperlink w:anchor="_Toc240268453" w:history="1">
+          <w:hyperlink w:anchor="_Toc240277951" w:history="1">
             <w:r>
               <w:rPr>
                 <w:rStyle w:val="Hyperlink"/>
@@ -5288,7 +5291,7 @@
               <w:rPr>
                 <w:noProof/>
               </w:rPr>
-              <w:instrText xml:space="preserve"> PAGEREF _Toc240268453 \h </w:instrText>
+              <w:instrText xml:space="preserve"> PAGEREF _Toc240277951 \h </w:instrText>
             </w:r>
             <w:r>
               <w:rPr>
@@ -5330,7 +5333,7 @@
               <w14:ligatures w14:val="standardContextual"/>
             </w:rPr>
           </w:pPr>
-          <w:hyperlink w:anchor="_Toc240268454" w:history="1">
+          <w:hyperlink w:anchor="_Toc240277952" w:history="1">
             <w:r>
               <w:rPr>
                 <w:rStyle w:val="Hyperlink"/>
@@ -5356,7 +5359,7 @@
               <w:rPr>
                 <w:noProof/>
               </w:rPr>
-              <w:instrText xml:space="preserve"> PAGEREF _Toc240268454 \h </w:instrText>
+              <w:instrText xml:space="preserve"> PAGEREF _Toc240277952 \h </w:instrText>
             </w:r>
             <w:r>
               <w:rPr>
@@ -5398,7 +5401,7 @@
               <w14:ligatures w14:val="standardContextual"/>
             </w:rPr>
           </w:pPr>
-          <w:hyperlink w:anchor="_Toc240268455" w:history="1">
+          <w:hyperlink w:anchor="_Toc240277953" w:history="1">
             <w:r>
               <w:rPr>
                 <w:rStyle w:val="Hyperlink"/>
@@ -5424,7 +5427,7 @@
               <w:rPr>
                 <w:noProof/>
               </w:rPr>
-              <w:instrText xml:space="preserve"> PAGEREF _Toc240268455 \h </w:instrText>
+              <w:instrText xml:space="preserve"> PAGEREF _Toc240277953 \h </w:instrText>
             </w:r>
             <w:r>
               <w:rPr>
@@ -5466,7 +5469,7 @@
               <w14:ligatures w14:val="standardContextual"/>
             </w:rPr>
           </w:pPr>
-          <w:hyperlink w:anchor="_Toc240268456" w:history="1">
+          <w:hyperlink w:anchor="_Toc240277954" w:history="1">
             <w:r>
               <w:rPr>
                 <w:rStyle w:val="Hyperlink"/>
@@ -5492,7 +5495,7 @@
               <w:rPr>
                 <w:noProof/>
               </w:rPr>
-              <w:instrText xml:space="preserve"> PAGEREF _Toc240268456 \h </w:instrText>
+              <w:instrText xml:space="preserve"> PAGEREF _Toc240277954 \h </w:instrText>
             </w:r>
             <w:r>
               <w:rPr>
@@ -5534,7 +5537,7 @@
               <w14:ligatures w14:val="standardContextual"/>
             </w:rPr>
           </w:pPr>
-          <w:hyperlink w:anchor="_Toc240268457" w:history="1">
+          <w:hyperlink w:anchor="_Toc240277955" w:history="1">
             <w:r>
               <w:rPr>
                 <w:rStyle w:val="Hyperlink"/>
@@ -5560,7 +5563,7 @@
               <w:rPr>
                 <w:noProof/>
               </w:rPr>
-              <w:instrText xml:space="preserve"> PAGEREF _Toc240268457 \h </w:instrText>
+              <w:instrText xml:space="preserve"> PAGEREF _Toc240277955 \h </w:instrText>
             </w:r>
             <w:r>
               <w:rPr>
@@ -5602,7 +5605,7 @@
               <w14:ligatures w14:val="standardContextual"/>
             </w:rPr>
           </w:pPr>
-          <w:hyperlink w:anchor="_Toc240268458" w:history="1">
+          <w:hyperlink w:anchor="_Toc240277956" w:history="1">
             <w:r>
               <w:rPr>
                 <w:rStyle w:val="Hyperlink"/>
@@ -5628,7 +5631,7 @@
               <w:rPr>
                 <w:noProof/>
               </w:rPr>
-              <w:instrText xml:space="preserve"> PAGEREF _Toc240268458 \h </w:instrText>
+              <w:instrText xml:space="preserve"> PAGEREF _Toc240277956 \h </w:instrText>
             </w:r>
             <w:r>
               <w:rPr>
@@ -5670,7 +5673,7 @@
               <w14:ligatures w14:val="standardContextual"/>
             </w:rPr>
           </w:pPr>
-          <w:hyperlink w:anchor="_Toc240268459" w:history="1">
+          <w:hyperlink w:anchor="_Toc240277957" w:history="1">
             <w:r>
               <w:rPr>
                 <w:rStyle w:val="Hyperlink"/>
@@ -5696,7 +5699,7 @@
               <w:rPr>
                 <w:noProof/>
               </w:rPr>
-              <w:instrText xml:space="preserve"> PAGEREF _Toc240268459 \h </w:instrText>
+              <w:instrText xml:space="preserve"> PAGEREF _Toc240277957 \h </w:instrText>
             </w:r>
             <w:r>
               <w:rPr>
@@ -5738,7 +5741,7 @@
               <w14:ligatures w14:val="standardContextual"/>
             </w:rPr>
           </w:pPr>
-          <w:hyperlink w:anchor="_Toc240268460" w:history="1">
+          <w:hyperlink w:anchor="_Toc240277958" w:history="1">
             <w:r>
               <w:rPr>
                 <w:rStyle w:val="Hyperlink"/>
@@ -5764,7 +5767,7 @@
               <w:rPr>
                 <w:noProof/>
               </w:rPr>
-              <w:instrText xml:space="preserve"> PAGEREF _Toc240268460 \h </w:instrText>
+              <w:instrText xml:space="preserve"> PAGEREF _Toc240277958 \h </w:instrText>
             </w:r>
             <w:r>
               <w:rPr>
@@ -5806,7 +5809,7 @@
               <w14:ligatures w14:val="standardContextual"/>
             </w:rPr>
           </w:pPr>
-          <w:hyperlink w:anchor="_Toc240268461" w:history="1">
+          <w:hyperlink w:anchor="_Toc240277959" w:history="1">
             <w:r>
               <w:rPr>
                 <w:rStyle w:val="Hyperlink"/>
@@ -5832,7 +5835,7 @@
               <w:rPr>
                 <w:noProof/>
               </w:rPr>
-              <w:instrText xml:space="preserve"> PAGEREF _Toc240268461 \h </w:instrText>
+              <w:instrText xml:space="preserve"> PAGEREF _Toc240277959 \h </w:instrText>
             </w:r>
             <w:r>
               <w:rPr>
@@ -5874,7 +5877,7 @@
               <w14:ligatures w14:val="standardContextual"/>
             </w:rPr>
           </w:pPr>
-          <w:hyperlink w:anchor="_Toc240268462" w:history="1">
+          <w:hyperlink w:anchor="_Toc240277960" w:history="1">
             <w:r>
               <w:rPr>
                 <w:rStyle w:val="Hyperlink"/>
@@ -5900,7 +5903,7 @@
               <w:rPr>
                 <w:noProof/>
               </w:rPr>
-              <w:instrText xml:space="preserve"> PAGEREF _Toc240268462 \h </w:instrText>
+              <w:instrText xml:space="preserve"> PAGEREF _Toc240277960 \h </w:instrText>
             </w:r>
             <w:r>
               <w:rPr>
@@ -5942,7 +5945,7 @@
               <w14:ligatures w14:val="standardContextual"/>
             </w:rPr>
           </w:pPr>
-          <w:hyperlink w:anchor="_Toc240268463" w:history="1">
+          <w:hyperlink w:anchor="_Toc240277961" w:history="1">
             <w:r>
               <w:rPr>
                 <w:rStyle w:val="Hyperlink"/>
@@ -5968,7 +5971,7 @@
               <w:rPr>
                 <w:noProof/>
               </w:rPr>
-              <w:instrText xml:space="preserve"> PAGEREF _Toc240268463 \h </w:instrText>
+              <w:instrText xml:space="preserve"> PAGEREF _Toc240277961 \h </w:instrText>
             </w:r>
             <w:r>
               <w:rPr>
@@ -6010,7 +6013,7 @@
               <w14:ligatures w14:val="standardContextual"/>
             </w:rPr>
           </w:pPr>
-          <w:hyperlink w:anchor="_Toc240268464" w:history="1">
+          <w:hyperlink w:anchor="_Toc240277962" w:history="1">
             <w:r>
               <w:rPr>
                 <w:rStyle w:val="Hyperlink"/>
@@ -6036,7 +6039,7 @@
               <w:rPr>
                 <w:noProof/>
               </w:rPr>
-              <w:instrText xml:space="preserve"> PAGEREF _Toc240268464 \h </w:instrText>
+              <w:instrText xml:space="preserve"> PAGEREF _Toc240277962 \h </w:instrText>
             </w:r>
             <w:r>
               <w:rPr>
@@ -6078,7 +6081,7 @@
               <w14:ligatures w14:val="standardContextual"/>
             </w:rPr>
           </w:pPr>
-          <w:hyperlink w:anchor="_Toc240268465" w:history="1">
+          <w:hyperlink w:anchor="_Toc240277963" w:history="1">
             <w:r>
               <w:rPr>
                 <w:rStyle w:val="Hyperlink"/>
@@ -6104,7 +6107,7 @@
               <w:rPr>
                 <w:noProof/>
               </w:rPr>
-              <w:instrText xml:space="preserve"> PAGEREF _Toc240268465 \h </w:instrText>
+              <w:instrText xml:space="preserve"> PAGEREF _Toc240277963 \h </w:instrText>
             </w:r>
             <w:r>
               <w:rPr>
@@ -6146,7 +6149,7 @@
               <w14:ligatures w14:val="standardContextual"/>
             </w:rPr>
           </w:pPr>
-          <w:hyperlink w:anchor="_Toc240268466" w:history="1">
+          <w:hyperlink w:anchor="_Toc240277964" w:history="1">
             <w:r>
               <w:rPr>
                 <w:rStyle w:val="Hyperlink"/>
@@ -6172,7 +6175,7 @@
               <w:rPr>
                 <w:noProof/>
               </w:rPr>
-              <w:instrText xml:space="preserve"> PAGEREF _Toc240268466 \h </w:instrText>
+              <w:instrText xml:space="preserve"> PAGEREF _Toc240277964 \h </w:instrText>
             </w:r>
             <w:r>
               <w:rPr>
@@ -6214,7 +6217,7 @@
               <w14:ligatures w14:val="standardContextual"/>
             </w:rPr>
           </w:pPr>
-          <w:hyperlink w:anchor="_Toc240268467" w:history="1">
+          <w:hyperlink w:anchor="_Toc240277965" w:history="1">
             <w:r>
               <w:rPr>
                 <w:rStyle w:val="Hyperlink"/>
@@ -6240,7 +6243,7 @@
               <w:rPr>
                 <w:noProof/>
               </w:rPr>
-              <w:instrText xml:space="preserve"> PAGEREF _Toc240268467 \h </w:instrText>
+              <w:instrText xml:space="preserve"> PAGEREF _Toc240277965 \h </w:instrText>
             </w:r>
             <w:r>
               <w:rPr>
@@ -6282,7 +6285,7 @@
               <w14:ligatures w14:val="standardContextual"/>
             </w:rPr>
           </w:pPr>
-          <w:hyperlink w:anchor="_Toc240268468" w:history="1">
+          <w:hyperlink w:anchor="_Toc240277966" w:history="1">
             <w:r>
               <w:rPr>
                 <w:rStyle w:val="Hyperlink"/>
@@ -6308,7 +6311,7 @@
               <w:rPr>
                 <w:noProof/>
               </w:rPr>
-              <w:instrText xml:space="preserve"> PAGEREF _Toc240268468 \h </w:instrText>
+              <w:instrText xml:space="preserve"> PAGEREF _Toc240277966 \h </w:instrText>
             </w:r>
             <w:r>
               <w:rPr>
@@ -6350,7 +6353,7 @@
               <w14:ligatures w14:val="standardContextual"/>
             </w:rPr>
           </w:pPr>
-          <w:hyperlink w:anchor="_Toc240268469" w:history="1">
+          <w:hyperlink w:anchor="_Toc240277967" w:history="1">
             <w:r>
               <w:rPr>
                 <w:rStyle w:val="Hyperlink"/>
@@ -6376,7 +6379,7 @@
               <w:rPr>
                 <w:noProof/>
               </w:rPr>
-              <w:instrText xml:space="preserve"> PAGEREF _Toc240268469 \h </w:instrText>
+              <w:instrText xml:space="preserve"> PAGEREF _Toc240277967 \h </w:instrText>
             </w:r>
             <w:r>
               <w:rPr>
@@ -6418,7 +6421,7 @@
               <w14:ligatures w14:val="standardContextual"/>
             </w:rPr>
           </w:pPr>
-          <w:hyperlink w:anchor="_Toc240268470" w:history="1">
+          <w:hyperlink w:anchor="_Toc240277968" w:history="1">
             <w:r>
               <w:rPr>
                 <w:rStyle w:val="Hyperlink"/>
@@ -6444,7 +6447,7 @@
               <w:rPr>
                 <w:noProof/>
               </w:rPr>
-              <w:instrText xml:space="preserve"> PAGEREF _Toc240268470 \h </w:instrText>
+              <w:instrText xml:space="preserve"> PAGEREF _Toc240277968 \h </w:instrText>
             </w:r>
             <w:r>
               <w:rPr>
@@ -6486,7 +6489,7 @@
               <w14:ligatures w14:val="standardContextual"/>
             </w:rPr>
           </w:pPr>
-          <w:hyperlink w:anchor="_Toc240268471" w:history="1">
+          <w:hyperlink w:anchor="_Toc240277969" w:history="1">
             <w:r>
               <w:rPr>
                 <w:rStyle w:val="Hyperlink"/>
@@ -6512,7 +6515,7 @@
               <w:rPr>
                 <w:noProof/>
               </w:rPr>
-              <w:instrText xml:space="preserve"> PAGEREF _Toc240268471 \h </w:instrText>
+              <w:instrText xml:space="preserve"> PAGEREF _Toc240277969 \h </w:instrText>
             </w:r>
             <w:r>
               <w:rPr>
@@ -6554,7 +6557,7 @@
               <w14:ligatures w14:val="standardContextual"/>
             </w:rPr>
           </w:pPr>
-          <w:hyperlink w:anchor="_Toc240268472" w:history="1">
+          <w:hyperlink w:anchor="_Toc240277970" w:history="1">
             <w:r>
               <w:rPr>
                 <w:rStyle w:val="Hyperlink"/>
@@ -6580,7 +6583,7 @@
               <w:rPr>
                 <w:noProof/>
               </w:rPr>
-              <w:instrText xml:space="preserve"> PAGEREF _Toc240268472 \h </w:instrText>
+              <w:instrText xml:space="preserve"> PAGEREF _Toc240277970 \h </w:instrText>
             </w:r>
             <w:r>
               <w:rPr>
@@ -6622,7 +6625,7 @@
               <w14:ligatures w14:val="standardContextual"/>
             </w:rPr>
           </w:pPr>
-          <w:hyperlink w:anchor="_Toc240268473" w:history="1">
+          <w:hyperlink w:anchor="_Toc240277971" w:history="1">
             <w:r>
               <w:rPr>
                 <w:rStyle w:val="Hyperlink"/>
@@ -6648,7 +6651,7 @@
               <w:rPr>
                 <w:noProof/>
               </w:rPr>
-              <w:instrText xml:space="preserve"> PAGEREF _Toc240268473 \h </w:instrText>
+              <w:instrText xml:space="preserve"> PAGEREF _Toc240277971 \h </w:instrText>
             </w:r>
             <w:r>
               <w:rPr>
@@ -6690,7 +6693,7 @@
               <w14:ligatures w14:val="standardContextual"/>
             </w:rPr>
           </w:pPr>
-          <w:hyperlink w:anchor="_Toc240268474" w:history="1">
+          <w:hyperlink w:anchor="_Toc240277972" w:history="1">
             <w:r>
               <w:rPr>
                 <w:rStyle w:val="Hyperlink"/>
@@ -6716,7 +6719,7 @@
               <w:rPr>
                 <w:noProof/>
               </w:rPr>
-              <w:instrText xml:space="preserve"> PAGEREF _Toc240268474 \h </w:instrText>
+              <w:instrText xml:space="preserve"> PAGEREF _Toc240277972 \h </w:instrText>
             </w:r>
             <w:r>
               <w:rPr>
@@ -6758,7 +6761,7 @@
               <w14:ligatures w14:val="standardContextual"/>
             </w:rPr>
           </w:pPr>
-          <w:hyperlink w:anchor="_Toc240268475" w:history="1">
+          <w:hyperlink w:anchor="_Toc240277973" w:history="1">
             <w:r>
               <w:rPr>
                 <w:rStyle w:val="Hyperlink"/>
@@ -6784,7 +6787,7 @@
               <w:rPr>
                 <w:noProof/>
               </w:rPr>
-              <w:instrText xml:space="preserve"> PAGEREF _Toc240268475 \h </w:instrText>
+              <w:instrText xml:space="preserve"> PAGEREF _Toc240277973 \h </w:instrText>
             </w:r>
             <w:r>
               <w:rPr>
@@ -6826,7 +6829,7 @@
               <w14:ligatures w14:val="standardContextual"/>
             </w:rPr>
           </w:pPr>
-          <w:hyperlink w:anchor="_Toc240268476" w:history="1">
+          <w:hyperlink w:anchor="_Toc240277974" w:history="1">
             <w:r>
               <w:rPr>
                 <w:rStyle w:val="Hyperlink"/>
@@ -6852,7 +6855,7 @@
               <w:rPr>
                 <w:noProof/>
               </w:rPr>
-              <w:instrText xml:space="preserve"> PAGEREF _Toc240268476 \h </w:instrText>
+              <w:instrText xml:space="preserve"> PAGEREF _Toc240277974 \h </w:instrText>
             </w:r>
             <w:r>
               <w:rPr>
@@ -6894,7 +6897,7 @@
               <w14:ligatures w14:val="standardContextual"/>
             </w:rPr>
           </w:pPr>
-          <w:hyperlink w:anchor="_Toc240268477" w:history="1">
+          <w:hyperlink w:anchor="_Toc240277975" w:history="1">
             <w:r>
               <w:rPr>
                 <w:rStyle w:val="Hyperlink"/>
@@ -6920,7 +6923,7 @@
               <w:rPr>
                 <w:noProof/>
               </w:rPr>
-              <w:instrText xml:space="preserve"> PAGEREF _Toc240268477 \h </w:instrText>
+              <w:instrText xml:space="preserve"> PAGEREF _Toc240277975 \h </w:instrText>
             </w:r>
             <w:r>
               <w:rPr>
@@ -6962,7 +6965,7 @@
               <w14:ligatures w14:val="standardContextual"/>
             </w:rPr>
           </w:pPr>
-          <w:hyperlink w:anchor="_Toc240268478" w:history="1">
+          <w:hyperlink w:anchor="_Toc240277976" w:history="1">
             <w:r>
               <w:rPr>
                 <w:rStyle w:val="Hyperlink"/>
@@ -6988,7 +6991,7 @@
               <w:rPr>
                 <w:noProof/>
               </w:rPr>
-              <w:instrText xml:space="preserve"> PAGEREF _Toc240268478 \h </w:instrText>
+              <w:instrText xml:space="preserve"> PAGEREF _Toc240277976 \h </w:instrText>
             </w:r>
             <w:r>
               <w:rPr>
@@ -7030,7 +7033,7 @@
               <w14:ligatures w14:val="standardContextual"/>
             </w:rPr>
           </w:pPr>
-          <w:hyperlink w:anchor="_Toc240268479" w:history="1">
+          <w:hyperlink w:anchor="_Toc240277977" w:history="1">
             <w:r>
               <w:rPr>
                 <w:rStyle w:val="Hyperlink"/>
@@ -7056,7 +7059,7 @@
               <w:rPr>
                 <w:noProof/>
               </w:rPr>
-              <w:instrText xml:space="preserve"> PAGEREF _Toc240268479 \h </w:instrText>
+              <w:instrText xml:space="preserve"> PAGEREF _Toc240277977 \h </w:instrText>
             </w:r>
             <w:r>
               <w:rPr>
@@ -7098,7 +7101,7 @@
               <w14:ligatures w14:val="standardContextual"/>
             </w:rPr>
           </w:pPr>
-          <w:hyperlink w:anchor="_Toc240268480" w:history="1">
+          <w:hyperlink w:anchor="_Toc240277978" w:history="1">
             <w:r>
               <w:rPr>
                 <w:rStyle w:val="Hyperlink"/>
@@ -7124,7 +7127,7 @@
               <w:rPr>
                 <w:noProof/>
               </w:rPr>
-              <w:instrText xml:space="preserve"> PAGEREF _Toc240268480 \h </w:instrText>
+              <w:instrText xml:space="preserve"> PAGEREF _Toc240277978 \h </w:instrText>
             </w:r>
             <w:r>
               <w:rPr>
@@ -7166,7 +7169,7 @@
               <w14:ligatures w14:val="standardContextual"/>
             </w:rPr>
           </w:pPr>
-          <w:hyperlink w:anchor="_Toc240268481" w:history="1">
+          <w:hyperlink w:anchor="_Toc240277979" w:history="1">
             <w:r>
               <w:rPr>
                 <w:rStyle w:val="Hyperlink"/>
@@ -7192,7 +7195,7 @@
               <w:rPr>
                 <w:noProof/>
               </w:rPr>
-              <w:instrText xml:space="preserve"> PAGEREF _Toc240268481 \h </w:instrText>
+              <w:instrText xml:space="preserve"> PAGEREF _Toc240277979 \h </w:instrText>
             </w:r>
             <w:r>
               <w:rPr>
@@ -7234,7 +7237,7 @@
               <w14:ligatures w14:val="standardContextual"/>
             </w:rPr>
           </w:pPr>
-          <w:hyperlink w:anchor="_Toc240268482" w:history="1">
+          <w:hyperlink w:anchor="_Toc240277980" w:history="1">
             <w:r>
               <w:rPr>
                 <w:rStyle w:val="Hyperlink"/>
@@ -7260,7 +7263,7 @@
               <w:rPr>
                 <w:noProof/>
               </w:rPr>
-              <w:instrText xml:space="preserve"> PAGEREF _Toc240268482 \h </w:instrText>
+              <w:instrText xml:space="preserve"> PAGEREF _Toc240277980 \h </w:instrText>
             </w:r>
             <w:r>
               <w:rPr>
@@ -7302,7 +7305,7 @@
               <w14:ligatures w14:val="standardContextual"/>
             </w:rPr>
           </w:pPr>
-          <w:hyperlink w:anchor="_Toc240268483" w:history="1">
+          <w:hyperlink w:anchor="_Toc240277981" w:history="1">
             <w:r>
               <w:rPr>
                 <w:rStyle w:val="Hyperlink"/>
@@ -7328,7 +7331,7 @@
               <w:rPr>
                 <w:noProof/>
               </w:rPr>
-              <w:instrText xml:space="preserve"> PAGEREF _Toc240268483 \h </w:instrText>
+              <w:instrText xml:space="preserve"> PAGEREF _Toc240277981 \h </w:instrText>
             </w:r>
             <w:r>
               <w:rPr>
@@ -7370,7 +7373,7 @@
               <w14:ligatures w14:val="standardContextual"/>
             </w:rPr>
           </w:pPr>
-          <w:hyperlink w:anchor="_Toc240268484" w:history="1">
+          <w:hyperlink w:anchor="_Toc240277982" w:history="1">
             <w:r>
               <w:rPr>
                 <w:rStyle w:val="Hyperlink"/>
@@ -7396,7 +7399,7 @@
               <w:rPr>
                 <w:noProof/>
               </w:rPr>
-              <w:instrText xml:space="preserve"> PAGEREF _Toc240268484 \h </w:instrText>
+              <w:instrText xml:space="preserve"> PAGEREF _Toc240277982 \h </w:instrText>
             </w:r>
             <w:r>
               <w:rPr>
@@ -7438,7 +7441,7 @@
               <w14:ligatures w14:val="standardContextual"/>
             </w:rPr>
           </w:pPr>
-          <w:hyperlink w:anchor="_Toc240268485" w:history="1">
+          <w:hyperlink w:anchor="_Toc240277983" w:history="1">
             <w:r>
               <w:rPr>
                 <w:rStyle w:val="Hyperlink"/>
@@ -7464,7 +7467,7 @@
               <w:rPr>
                 <w:noProof/>
               </w:rPr>
-              <w:instrText xml:space="preserve"> PAGEREF _Toc240268485 \h </w:instrText>
+              <w:instrText xml:space="preserve"> PAGEREF _Toc240277983 \h </w:instrText>
             </w:r>
             <w:r>
               <w:rPr>
@@ -7506,7 +7509,7 @@
               <w14:ligatures w14:val="standardContextual"/>
             </w:rPr>
           </w:pPr>
-          <w:hyperlink w:anchor="_Toc240268486" w:history="1">
+          <w:hyperlink w:anchor="_Toc240277984" w:history="1">
             <w:r>
               <w:rPr>
                 <w:rStyle w:val="Hyperlink"/>
@@ -7532,7 +7535,7 @@
               <w:rPr>
                 <w:noProof/>
               </w:rPr>
-              <w:instrText xml:space="preserve"> PAGEREF _Toc240268486 \h </w:instrText>
+              <w:instrText xml:space="preserve"> PAGEREF _Toc240277984 \h </w:instrText>
             </w:r>
             <w:r>
               <w:rPr>
@@ -7574,7 +7577,7 @@
               <w14:ligatures w14:val="standardContextual"/>
             </w:rPr>
           </w:pPr>
-          <w:hyperlink w:anchor="_Toc240268487" w:history="1">
+          <w:hyperlink w:anchor="_Toc240277985" w:history="1">
             <w:r>
               <w:rPr>
                 <w:rStyle w:val="Hyperlink"/>
@@ -7600,7 +7603,7 @@
               <w:rPr>
                 <w:noProof/>
               </w:rPr>
-              <w:instrText xml:space="preserve"> PAGEREF _Toc240268487 \h </w:instrText>
+              <w:instrText xml:space="preserve"> PAGEREF _Toc240277985 \h </w:instrText>
             </w:r>
             <w:r>
               <w:rPr>
@@ -7642,7 +7645,7 @@
               <w14:ligatures w14:val="standardContextual"/>
             </w:rPr>
           </w:pPr>
-          <w:hyperlink w:anchor="_Toc240268488" w:history="1">
+          <w:hyperlink w:anchor="_Toc240277986" w:history="1">
             <w:r>
               <w:rPr>
                 <w:rStyle w:val="Hyperlink"/>
@@ -7668,7 +7671,7 @@
               <w:rPr>
                 <w:noProof/>
               </w:rPr>
-              <w:instrText xml:space="preserve"> PAGEREF _Toc240268488 \h </w:instrText>
+              <w:instrText xml:space="preserve"> PAGEREF _Toc240277986 \h </w:instrText>
             </w:r>
             <w:r>
               <w:rPr>
@@ -7710,7 +7713,7 @@
               <w14:ligatures w14:val="standardContextual"/>
             </w:rPr>
           </w:pPr>
-          <w:hyperlink w:anchor="_Toc240268489" w:history="1">
+          <w:hyperlink w:anchor="_Toc240277987" w:history="1">
             <w:r>
               <w:rPr>
                 <w:rStyle w:val="Hyperlink"/>
@@ -7736,7 +7739,7 @@
               <w:rPr>
                 <w:noProof/>
               </w:rPr>
-              <w:instrText xml:space="preserve"> PAGEREF _Toc240268489 \h </w:instrText>
+              <w:instrText xml:space="preserve"> PAGEREF _Toc240277987 \h </w:instrText>
             </w:r>
             <w:r>
               <w:rPr>
@@ -7778,7 +7781,7 @@
               <w14:ligatures w14:val="standardContextual"/>
             </w:rPr>
           </w:pPr>
-          <w:hyperlink w:anchor="_Toc240268490" w:history="1">
+          <w:hyperlink w:anchor="_Toc240277988" w:history="1">
             <w:r>
               <w:rPr>
                 <w:rStyle w:val="Hyperlink"/>
@@ -7804,7 +7807,7 @@
               <w:rPr>
                 <w:noProof/>
               </w:rPr>
-              <w:instrText xml:space="preserve"> PAGEREF _Toc240268490 \h </w:instrText>
+              <w:instrText xml:space="preserve"> PAGEREF _Toc240277988 \h </w:instrText>
             </w:r>
             <w:r>
               <w:rPr>
@@ -7846,7 +7849,7 @@
               <w14:ligatures w14:val="standardContextual"/>
             </w:rPr>
           </w:pPr>
-          <w:hyperlink w:anchor="_Toc240268491" w:history="1">
+          <w:hyperlink w:anchor="_Toc240277989" w:history="1">
             <w:r>
               <w:rPr>
                 <w:rStyle w:val="Hyperlink"/>
@@ -7872,7 +7875,7 @@
               <w:rPr>
                 <w:noProof/>
               </w:rPr>
-              <w:instrText xml:space="preserve"> PAGEREF _Toc240268491 \h </w:instrText>
+              <w:instrText xml:space="preserve"> PAGEREF _Toc240277989 \h </w:instrText>
             </w:r>
             <w:r>
               <w:rPr>
@@ -7914,7 +7917,7 @@
               <w14:ligatures w14:val="standardContextual"/>
             </w:rPr>
           </w:pPr>
-          <w:hyperlink w:anchor="_Toc240268492" w:history="1">
+          <w:hyperlink w:anchor="_Toc240277990" w:history="1">
             <w:r>
               <w:rPr>
                 <w:rStyle w:val="Hyperlink"/>
@@ -7940,7 +7943,7 @@
               <w:rPr>
                 <w:noProof/>
               </w:rPr>
-              <w:instrText xml:space="preserve"> PAGEREF _Toc240268492 \h </w:instrText>
+              <w:instrText xml:space="preserve"> PAGEREF _Toc240277990 \h </w:instrText>
             </w:r>
             <w:r>
               <w:rPr>
@@ -7982,7 +7985,7 @@
               <w14:ligatures w14:val="standardContextual"/>
             </w:rPr>
           </w:pPr>
-          <w:hyperlink w:anchor="_Toc240268493" w:history="1">
+          <w:hyperlink w:anchor="_Toc240277991" w:history="1">
             <w:r>
               <w:rPr>
                 <w:rStyle w:val="Hyperlink"/>
@@ -8008,7 +8011,7 @@
               <w:rPr>
                 <w:noProof/>
               </w:rPr>
-              <w:instrText xml:space="preserve"> PAGEREF _Toc240268493 \h </w:instrText>
+              <w:instrText xml:space="preserve"> PAGEREF _Toc240277991 \h </w:instrText>
             </w:r>
             <w:r>
               <w:rPr>
@@ -8050,7 +8053,7 @@
               <w14:ligatures w14:val="standardContextual"/>
             </w:rPr>
           </w:pPr>
-          <w:hyperlink w:anchor="_Toc240268494" w:history="1">
+          <w:hyperlink w:anchor="_Toc240277992" w:history="1">
             <w:r>
               <w:rPr>
                 <w:rStyle w:val="Hyperlink"/>
@@ -8076,7 +8079,7 @@
               <w:rPr>
                 <w:noProof/>
               </w:rPr>
-              <w:instrText xml:space="preserve"> PAGEREF _Toc240268494 \h </w:instrText>
+              <w:instrText xml:space="preserve"> PAGEREF _Toc240277992 \h </w:instrText>
             </w:r>
             <w:r>
               <w:rPr>
@@ -8118,7 +8121,7 @@
               <w14:ligatures w14:val="standardContextual"/>
             </w:rPr>
           </w:pPr>
-          <w:hyperlink w:anchor="_Toc240268495" w:history="1">
+          <w:hyperlink w:anchor="_Toc240277993" w:history="1">
             <w:r>
               <w:rPr>
                 <w:rStyle w:val="Hyperlink"/>
@@ -8144,7 +8147,7 @@
               <w:rPr>
                 <w:noProof/>
               </w:rPr>
-              <w:instrText xml:space="preserve"> PAGEREF _Toc240268495 \h </w:instrText>
+              <w:instrText xml:space="preserve"> PAGEREF _Toc240277993 \h </w:instrText>
             </w:r>
             <w:r>
               <w:rPr>
@@ -8186,7 +8189,7 @@
               <w14:ligatures w14:val="standardContextual"/>
             </w:rPr>
           </w:pPr>
-          <w:hyperlink w:anchor="_Toc240268496" w:history="1">
+          <w:hyperlink w:anchor="_Toc240277994" w:history="1">
             <w:r>
               <w:rPr>
                 <w:rStyle w:val="Hyperlink"/>
@@ -8212,7 +8215,7 @@
               <w:rPr>
                 <w:noProof/>
               </w:rPr>
-              <w:instrText xml:space="preserve"> PAGEREF _Toc240268496 \h </w:instrText>
+              <w:instrText xml:space="preserve"> PAGEREF _Toc240277994 \h </w:instrText>
             </w:r>
             <w:r>
               <w:rPr>
@@ -8254,7 +8257,7 @@
               <w14:ligatures w14:val="standardContextual"/>
             </w:rPr>
           </w:pPr>
-          <w:hyperlink w:anchor="_Toc240268497" w:history="1">
+          <w:hyperlink w:anchor="_Toc240277995" w:history="1">
             <w:r>
               <w:rPr>
                 <w:rStyle w:val="Hyperlink"/>
@@ -8280,7 +8283,7 @@
               <w:rPr>
                 <w:noProof/>
               </w:rPr>
-              <w:instrText xml:space="preserve"> PAGEREF _Toc240268497 \h </w:instrText>
+              <w:instrText xml:space="preserve"> PAGEREF _Toc240277995 \h </w:instrText>
             </w:r>
             <w:r>
               <w:rPr>
@@ -8322,7 +8325,7 @@
               <w14:ligatures w14:val="standardContextual"/>
             </w:rPr>
           </w:pPr>
-          <w:hyperlink w:anchor="_Toc240268498" w:history="1">
+          <w:hyperlink w:anchor="_Toc240277996" w:history="1">
             <w:r>
               <w:rPr>
                 <w:rStyle w:val="Hyperlink"/>
@@ -8348,7 +8351,7 @@
               <w:rPr>
                 <w:noProof/>
               </w:rPr>
-              <w:instrText xml:space="preserve"> PAGEREF _Toc240268498 \h </w:instrText>
+              <w:instrText xml:space="preserve"> PAGEREF _Toc240277996 \h </w:instrText>
             </w:r>
             <w:r>
               <w:rPr>
@@ -8390,7 +8393,7 @@
               <w14:ligatures w14:val="standardContextual"/>
             </w:rPr>
           </w:pPr>
-          <w:hyperlink w:anchor="_Toc240268499" w:history="1">
+          <w:hyperlink w:anchor="_Toc240277997" w:history="1">
             <w:r>
               <w:rPr>
                 <w:rStyle w:val="Hyperlink"/>
@@ -8416,7 +8419,7 @@
               <w:rPr>
                 <w:noProof/>
               </w:rPr>
-              <w:instrText xml:space="preserve"> PAGEREF _Toc240268499 \h </w:instrText>
+              <w:instrText xml:space="preserve"> PAGEREF _Toc240277997 \h </w:instrText>
             </w:r>
             <w:r>
               <w:rPr>
@@ -8458,7 +8461,7 @@
               <w14:ligatures w14:val="standardContextual"/>
             </w:rPr>
           </w:pPr>
-          <w:hyperlink w:anchor="_Toc240268500" w:history="1">
+          <w:hyperlink w:anchor="_Toc240277998" w:history="1">
             <w:r>
               <w:rPr>
                 <w:rStyle w:val="Hyperlink"/>
@@ -8484,7 +8487,7 @@
               <w:rPr>
                 <w:noProof/>
               </w:rPr>
-              <w:instrText xml:space="preserve"> PAGEREF _Toc240268500 \h </w:instrText>
+              <w:instrText xml:space="preserve"> PAGEREF _Toc240277998 \h </w:instrText>
             </w:r>
             <w:r>
               <w:rPr>
@@ -8526,7 +8529,7 @@
               <w14:ligatures w14:val="standardContextual"/>
             </w:rPr>
           </w:pPr>
-          <w:hyperlink w:anchor="_Toc240268501" w:history="1">
+          <w:hyperlink w:anchor="_Toc240277999" w:history="1">
             <w:r>
               <w:rPr>
                 <w:rStyle w:val="Hyperlink"/>
@@ -8552,7 +8555,7 @@
               <w:rPr>
                 <w:noProof/>
               </w:rPr>
-              <w:instrText xml:space="preserve"> PAGEREF _Toc240268501 \h </w:instrText>
+              <w:instrText xml:space="preserve"> PAGEREF _Toc240277999 \h </w:instrText>
             </w:r>
             <w:r>
               <w:rPr>
@@ -8594,7 +8597,7 @@
               <w14:ligatures w14:val="standardContextual"/>
             </w:rPr>
           </w:pPr>
-          <w:hyperlink w:anchor="_Toc240268502" w:history="1">
+          <w:hyperlink w:anchor="_Toc240278000" w:history="1">
             <w:r>
               <w:rPr>
                 <w:rStyle w:val="Hyperlink"/>
@@ -8620,7 +8623,7 @@
               <w:rPr>
                 <w:noProof/>
               </w:rPr>
-              <w:instrText xml:space="preserve"> PAGEREF _Toc240268502 \h </w:instrText>
+              <w:instrText xml:space="preserve"> PAGEREF _Toc240278000 \h </w:instrText>
             </w:r>
             <w:r>
               <w:rPr>
@@ -8662,7 +8665,7 @@
               <w14:ligatures w14:val="standardContextual"/>
             </w:rPr>
           </w:pPr>
-          <w:hyperlink w:anchor="_Toc240268503" w:history="1">
+          <w:hyperlink w:anchor="_Toc240278001" w:history="1">
             <w:r>
               <w:rPr>
                 <w:rStyle w:val="Hyperlink"/>
@@ -8688,7 +8691,7 @@
               <w:rPr>
                 <w:noProof/>
               </w:rPr>
-              <w:instrText xml:space="preserve"> PAGEREF _Toc240268503 \h </w:instrText>
+              <w:instrText xml:space="preserve"> PAGEREF _Toc240278001 \h </w:instrText>
             </w:r>
             <w:r>
               <w:rPr>
@@ -8730,7 +8733,7 @@
               <w14:ligatures w14:val="standardContextual"/>
             </w:rPr>
           </w:pPr>
-          <w:hyperlink w:anchor="_Toc240268504" w:history="1">
+          <w:hyperlink w:anchor="_Toc240278002" w:history="1">
             <w:r>
               <w:rPr>
                 <w:rStyle w:val="Hyperlink"/>
@@ -8756,7 +8759,7 @@
               <w:rPr>
                 <w:noProof/>
               </w:rPr>
-              <w:instrText xml:space="preserve"> PAGEREF _Toc240268504 \h </w:instrText>
+              <w:instrText xml:space="preserve"> PAGEREF _Toc240278002 \h </w:instrText>
             </w:r>
             <w:r>
               <w:rPr>
@@ -8798,7 +8801,7 @@
               <w14:ligatures w14:val="standardContextual"/>
             </w:rPr>
           </w:pPr>
-          <w:hyperlink w:anchor="_Toc240268505" w:history="1">
+          <w:hyperlink w:anchor="_Toc240278003" w:history="1">
             <w:r>
               <w:rPr>
                 <w:rStyle w:val="Hyperlink"/>
@@ -8824,7 +8827,7 @@
               <w:rPr>
                 <w:noProof/>
               </w:rPr>
-              <w:instrText xml:space="preserve"> PAGEREF _Toc240268505 \h </w:instrText>
+              <w:instrText xml:space="preserve"> PAGEREF _Toc240278003 \h </w:instrText>
             </w:r>
             <w:r>
               <w:rPr>
@@ -8866,7 +8869,7 @@
               <w14:ligatures w14:val="standardContextual"/>
             </w:rPr>
           </w:pPr>
-          <w:hyperlink w:anchor="_Toc240268506" w:history="1">
+          <w:hyperlink w:anchor="_Toc240278004" w:history="1">
             <w:r>
               <w:rPr>
                 <w:rStyle w:val="Hyperlink"/>
@@ -8892,7 +8895,7 @@
               <w:rPr>
                 <w:noProof/>
               </w:rPr>
-              <w:instrText xml:space="preserve"> PAGEREF _Toc240268506 \h </w:instrText>
+              <w:instrText xml:space="preserve"> PAGEREF _Toc240278004 \h </w:instrText>
             </w:r>
             <w:r>
               <w:rPr>
@@ -8934,7 +8937,7 @@
               <w14:ligatures w14:val="standardContextual"/>
             </w:rPr>
           </w:pPr>
-          <w:hyperlink w:anchor="_Toc240268507" w:history="1">
+          <w:hyperlink w:anchor="_Toc240278005" w:history="1">
             <w:r>
               <w:rPr>
                 <w:rStyle w:val="Hyperlink"/>
@@ -8960,7 +8963,7 @@
               <w:rPr>
                 <w:noProof/>
               </w:rPr>
-              <w:instrText xml:space="preserve"> PAGEREF _Toc240268507 \h </w:instrText>
+              <w:instrText xml:space="preserve"> PAGEREF _Toc240278005 \h </w:instrText>
             </w:r>
             <w:r>
               <w:rPr>
@@ -9005,7 +9008,7 @@
         <w:spacing w:before="480" w:after="240"/>
       </w:pPr>
       <w:bookmarkStart w:id="0" w:name="_Toc239402900"/>
-      <w:bookmarkStart w:id="1" w:name="_Toc240268385"/>
+      <w:bookmarkStart w:id="1" w:name="_Toc240277883"/>
       <w:r>
         <w:rPr>
           <w:b/>
@@ -9096,7 +9099,7 @@
         <w:pStyle w:val="Heading1"/>
         <w:spacing w:before="480" w:after="240"/>
       </w:pPr>
-      <w:bookmarkStart w:id="2" w:name="_Toc240268386"/>
+      <w:bookmarkStart w:id="2" w:name="_Toc240277884"/>
       <w:r>
         <w:rPr>
           <w:b/>
@@ -9130,7 +9133,7 @@
         <w:pStyle w:val="Heading2"/>
         <w:spacing w:before="360" w:after="180"/>
       </w:pPr>
-      <w:bookmarkStart w:id="3" w:name="_Toc240268387"/>
+      <w:bookmarkStart w:id="3" w:name="_Toc240277885"/>
       <w:r>
         <w:rPr>
           <w:b/>
@@ -9479,7 +9482,7 @@
         <w:pStyle w:val="Heading2"/>
         <w:spacing w:before="360" w:after="180"/>
       </w:pPr>
-      <w:bookmarkStart w:id="4" w:name="_Toc240268388"/>
+      <w:bookmarkStart w:id="4" w:name="_Toc240277886"/>
       <w:r>
         <w:rPr>
           <w:b/>
@@ -9503,7 +9506,7 @@
         <w:pStyle w:val="Heading4"/>
         <w:spacing w:before="220" w:after="120"/>
       </w:pPr>
-      <w:bookmarkStart w:id="5" w:name="_Toc240268389"/>
+      <w:bookmarkStart w:id="5" w:name="_Toc240277887"/>
       <w:r>
         <w:rPr>
           <w:b/>
@@ -9527,7 +9530,7 @@
         <w:pStyle w:val="Heading4"/>
         <w:spacing w:before="220" w:after="120"/>
       </w:pPr>
-      <w:bookmarkStart w:id="6" w:name="_Toc240268390"/>
+      <w:bookmarkStart w:id="6" w:name="_Toc240277888"/>
       <w:r>
         <w:rPr>
           <w:b/>
@@ -9550,7 +9553,7 @@
         <w:pStyle w:val="Heading4"/>
         <w:spacing w:before="220" w:after="120"/>
       </w:pPr>
-      <w:bookmarkStart w:id="7" w:name="_Toc240268391"/>
+      <w:bookmarkStart w:id="7" w:name="_Toc240277889"/>
       <w:r>
         <w:rPr>
           <w:b/>
@@ -9573,7 +9576,7 @@
         <w:pStyle w:val="Heading4"/>
         <w:spacing w:before="220" w:after="120"/>
       </w:pPr>
-      <w:bookmarkStart w:id="8" w:name="_Toc240268392"/>
+      <w:bookmarkStart w:id="8" w:name="_Toc240277890"/>
       <w:r>
         <w:rPr>
           <w:b/>
@@ -9596,7 +9599,7 @@
         <w:pStyle w:val="Heading2"/>
         <w:spacing w:before="360" w:after="180"/>
       </w:pPr>
-      <w:bookmarkStart w:id="9" w:name="_Toc240268393"/>
+      <w:bookmarkStart w:id="9" w:name="_Toc240277891"/>
       <w:r>
         <w:rPr>
           <w:b/>
@@ -10125,7 +10128,7 @@
         <w:pStyle w:val="Heading2"/>
         <w:spacing w:before="360" w:after="180"/>
       </w:pPr>
-      <w:bookmarkStart w:id="10" w:name="_Toc240268394"/>
+      <w:bookmarkStart w:id="10" w:name="_Toc240277892"/>
       <w:r>
         <w:rPr>
           <w:b/>
@@ -10467,7 +10470,7 @@
         <w:pStyle w:val="Heading2"/>
         <w:spacing w:before="360" w:after="180"/>
       </w:pPr>
-      <w:bookmarkStart w:id="11" w:name="_Toc240268395"/>
+      <w:bookmarkStart w:id="11" w:name="_Toc240277893"/>
       <w:r>
         <w:rPr>
           <w:b/>
@@ -10905,7 +10908,7 @@
         <w:pStyle w:val="Heading4"/>
         <w:spacing w:before="220" w:after="120"/>
       </w:pPr>
-      <w:bookmarkStart w:id="12" w:name="_Toc240268396"/>
+      <w:bookmarkStart w:id="12" w:name="_Toc240277894"/>
       <w:r>
         <w:rPr>
           <w:b/>
@@ -10928,7 +10931,7 @@
         <w:pStyle w:val="Heading2"/>
         <w:spacing w:before="360" w:after="180"/>
       </w:pPr>
-      <w:bookmarkStart w:id="13" w:name="_Toc240268397"/>
+      <w:bookmarkStart w:id="13" w:name="_Toc240277895"/>
       <w:r>
         <w:rPr>
           <w:b/>
@@ -11029,7 +11032,7 @@
         <w:pStyle w:val="Heading2"/>
         <w:spacing w:before="360" w:after="180"/>
       </w:pPr>
-      <w:bookmarkStart w:id="14" w:name="_Toc240268398"/>
+      <w:bookmarkStart w:id="14" w:name="_Toc240277896"/>
       <w:r>
         <w:rPr>
           <w:b/>
@@ -11370,7 +11373,7 @@
         <w:pStyle w:val="Heading2"/>
         <w:spacing w:before="360" w:after="180"/>
       </w:pPr>
-      <w:bookmarkStart w:id="15" w:name="_Toc240268399"/>
+      <w:bookmarkStart w:id="15" w:name="_Toc240277897"/>
       <w:r>
         <w:rPr>
           <w:b/>
@@ -11394,7 +11397,7 @@
         <w:pStyle w:val="Heading4"/>
         <w:spacing w:before="220" w:after="120"/>
       </w:pPr>
-      <w:bookmarkStart w:id="16" w:name="_Toc240268400"/>
+      <w:bookmarkStart w:id="16" w:name="_Toc240277898"/>
       <w:r>
         <w:rPr>
           <w:b/>
@@ -11461,7 +11464,7 @@
         <w:pStyle w:val="Heading4"/>
         <w:spacing w:before="220" w:after="120"/>
       </w:pPr>
-      <w:bookmarkStart w:id="17" w:name="_Toc240268401"/>
+      <w:bookmarkStart w:id="17" w:name="_Toc240277899"/>
       <w:r>
         <w:rPr>
           <w:b/>
@@ -11529,7 +11532,7 @@
         <w:pStyle w:val="Heading4"/>
         <w:spacing w:before="220" w:after="120"/>
       </w:pPr>
-      <w:bookmarkStart w:id="18" w:name="_Toc240268402"/>
+      <w:bookmarkStart w:id="18" w:name="_Toc240277900"/>
       <w:r>
         <w:rPr>
           <w:b/>
@@ -11607,7 +11610,7 @@
         <w:pStyle w:val="Heading2"/>
         <w:spacing w:before="360" w:after="180"/>
       </w:pPr>
-      <w:bookmarkStart w:id="19" w:name="_Toc240268403"/>
+      <w:bookmarkStart w:id="19" w:name="_Toc240277901"/>
       <w:r>
         <w:rPr>
           <w:b/>
@@ -11992,7 +11995,7 @@
         <w:pStyle w:val="Heading2"/>
         <w:spacing w:before="360" w:after="180"/>
       </w:pPr>
-      <w:bookmarkStart w:id="20" w:name="_Toc240268404"/>
+      <w:bookmarkStart w:id="20" w:name="_Toc240277902"/>
       <w:r>
         <w:rPr>
           <w:b/>
@@ -12008,7 +12011,7 @@
         <w:pStyle w:val="Heading4"/>
         <w:spacing w:before="220" w:after="120"/>
       </w:pPr>
-      <w:bookmarkStart w:id="21" w:name="_Toc240268405"/>
+      <w:bookmarkStart w:id="21" w:name="_Toc240277903"/>
       <w:r>
         <w:rPr>
           <w:b/>
@@ -12031,7 +12034,7 @@
         <w:pStyle w:val="Heading4"/>
         <w:spacing w:before="220" w:after="120"/>
       </w:pPr>
-      <w:bookmarkStart w:id="22" w:name="_Toc240268406"/>
+      <w:bookmarkStart w:id="22" w:name="_Toc240277904"/>
       <w:r>
         <w:rPr>
           <w:b/>
@@ -12054,7 +12057,7 @@
         <w:pStyle w:val="Heading4"/>
         <w:spacing w:before="220" w:after="120"/>
       </w:pPr>
-      <w:bookmarkStart w:id="23" w:name="_Toc240268407"/>
+      <w:bookmarkStart w:id="23" w:name="_Toc240277905"/>
       <w:r>
         <w:rPr>
           <w:b/>
@@ -12113,7 +12116,7 @@
         <w:pStyle w:val="Heading1"/>
         <w:spacing w:before="480" w:after="240"/>
       </w:pPr>
-      <w:bookmarkStart w:id="24" w:name="_Toc240268408"/>
+      <w:bookmarkStart w:id="24" w:name="_Toc240277906"/>
       <w:r>
         <w:rPr>
           <w:b/>
@@ -12378,13 +12381,16 @@
             <w:vAlign w:val="center"/>
           </w:tcPr>
           <w:p>
-            <w:r>
-              <w:rPr>
-                <w:sz w:val="19"/>
-                <w:szCs w:val="19"/>
-              </w:rPr>
-              <w:t>github.com/spetren/contract-legal-intelligence-agent-lab</w:t>
-            </w:r>
+            <w:hyperlink r:id="rId6" w:history="1">
+              <w:r>
+                <w:rPr>
+                  <w:rStyle w:val="Hyperlink"/>
+                  <w:sz w:val="19"/>
+                  <w:szCs w:val="19"/>
+                </w:rPr>
+                <w:t>github.com/spetren/contract-legal-intelligence-agent-lab</w:t>
+              </w:r>
+            </w:hyperlink>
           </w:p>
         </w:tc>
       </w:tr>
@@ -12914,7 +12920,7 @@
         <w:pStyle w:val="Heading1"/>
         <w:spacing w:before="480" w:after="240"/>
       </w:pPr>
-      <w:bookmarkStart w:id="25" w:name="_Toc240268409"/>
+      <w:bookmarkStart w:id="25" w:name="_Toc240277907"/>
       <w:r>
         <w:rPr>
           <w:b/>
@@ -13782,7 +13788,7 @@
         <w:pStyle w:val="Heading2"/>
         <w:spacing w:before="360" w:after="180"/>
       </w:pPr>
-      <w:bookmarkStart w:id="26" w:name="_Toc240268410"/>
+      <w:bookmarkStart w:id="26" w:name="_Toc240277908"/>
       <w:r>
         <w:rPr>
           <w:b/>
@@ -14238,7 +14244,7 @@
         <w:pStyle w:val="Heading2"/>
         <w:spacing w:before="360" w:after="180"/>
       </w:pPr>
-      <w:bookmarkStart w:id="27" w:name="_Toc240268411"/>
+      <w:bookmarkStart w:id="27" w:name="_Toc240277909"/>
       <w:r>
         <w:rPr>
           <w:b/>
@@ -14527,7 +14533,7 @@
         <w:pStyle w:val="Heading1"/>
         <w:spacing w:before="480" w:after="240"/>
       </w:pPr>
-      <w:bookmarkStart w:id="28" w:name="_Toc240268412"/>
+      <w:bookmarkStart w:id="28" w:name="_Toc240277910"/>
       <w:r>
         <w:rPr>
           <w:b/>
@@ -14805,7 +14811,7 @@
         <w:pStyle w:val="Heading1"/>
         <w:spacing w:before="480" w:after="240"/>
       </w:pPr>
-      <w:bookmarkStart w:id="29" w:name="_Toc240268413"/>
+      <w:bookmarkStart w:id="29" w:name="_Toc240277911"/>
       <w:r>
         <w:rPr>
           <w:b/>
@@ -15055,7 +15061,7 @@
         <w:pStyle w:val="Heading2"/>
         <w:spacing w:before="360" w:after="180"/>
       </w:pPr>
-      <w:bookmarkStart w:id="30" w:name="_Toc240268414"/>
+      <w:bookmarkStart w:id="30" w:name="_Toc240277912"/>
       <w:r>
         <w:rPr>
           <w:b/>
@@ -15561,7 +15567,7 @@
         <w:pStyle w:val="Heading2"/>
         <w:spacing w:before="360" w:after="180"/>
       </w:pPr>
-      <w:bookmarkStart w:id="31" w:name="_Toc240268415"/>
+      <w:bookmarkStart w:id="31" w:name="_Toc240277913"/>
       <w:r>
         <w:rPr>
           <w:b/>
@@ -16213,7 +16219,7 @@
         <w:pStyle w:val="Heading4"/>
         <w:spacing w:before="220" w:after="120"/>
       </w:pPr>
-      <w:bookmarkStart w:id="32" w:name="_Toc240268416"/>
+      <w:bookmarkStart w:id="32" w:name="_Toc240277914"/>
       <w:r>
         <w:rPr>
           <w:b/>
@@ -16343,7 +16349,7 @@
         <w:pStyle w:val="Heading2"/>
         <w:spacing w:before="360" w:after="180"/>
       </w:pPr>
-      <w:bookmarkStart w:id="33" w:name="_Toc240268417"/>
+      <w:bookmarkStart w:id="33" w:name="_Toc240277915"/>
       <w:r>
         <w:rPr>
           <w:b/>
@@ -16834,7 +16840,7 @@
         <w:pStyle w:val="Heading2"/>
         <w:spacing w:before="360" w:after="180"/>
       </w:pPr>
-      <w:bookmarkStart w:id="34" w:name="_Toc240268418"/>
+      <w:bookmarkStart w:id="34" w:name="_Toc240277916"/>
       <w:r>
         <w:rPr>
           <w:b/>
@@ -17327,7 +17333,7 @@
         <w:pStyle w:val="Heading2"/>
         <w:spacing w:before="360" w:after="180"/>
       </w:pPr>
-      <w:bookmarkStart w:id="35" w:name="_Toc240268419"/>
+      <w:bookmarkStart w:id="35" w:name="_Toc240277917"/>
       <w:r>
         <w:rPr>
           <w:b/>
@@ -17343,7 +17349,7 @@
         <w:pStyle w:val="Heading4"/>
         <w:spacing w:before="220" w:after="120"/>
       </w:pPr>
-      <w:bookmarkStart w:id="36" w:name="_Toc240268420"/>
+      <w:bookmarkStart w:id="36" w:name="_Toc240277918"/>
       <w:r>
         <w:rPr>
           <w:b/>
@@ -17366,7 +17372,7 @@
         <w:pStyle w:val="Heading4"/>
         <w:spacing w:before="220" w:after="120"/>
       </w:pPr>
-      <w:bookmarkStart w:id="37" w:name="_Toc240268421"/>
+      <w:bookmarkStart w:id="37" w:name="_Toc240277919"/>
       <w:r>
         <w:rPr>
           <w:b/>
@@ -17413,7 +17419,7 @@
         <w:pStyle w:val="Heading2"/>
         <w:spacing w:before="360" w:after="180"/>
       </w:pPr>
-      <w:bookmarkStart w:id="38" w:name="_Toc240268422"/>
+      <w:bookmarkStart w:id="38" w:name="_Toc240277920"/>
       <w:r>
         <w:rPr>
           <w:b/>
@@ -17572,7 +17578,7 @@
         <w:pStyle w:val="Heading2"/>
         <w:spacing w:before="360" w:after="180"/>
       </w:pPr>
-      <w:bookmarkStart w:id="39" w:name="_Toc240268423"/>
+      <w:bookmarkStart w:id="39" w:name="_Toc240277921"/>
       <w:r>
         <w:rPr>
           <w:b/>
@@ -17708,7 +17714,7 @@
         <w:pStyle w:val="Heading2"/>
         <w:spacing w:before="360" w:after="180"/>
       </w:pPr>
-      <w:bookmarkStart w:id="40" w:name="_Toc240268424"/>
+      <w:bookmarkStart w:id="40" w:name="_Toc240277922"/>
       <w:r>
         <w:rPr>
           <w:b/>
@@ -17786,7 +17792,7 @@
         <w:pStyle w:val="Heading2"/>
         <w:spacing w:before="360" w:after="180"/>
       </w:pPr>
-      <w:bookmarkStart w:id="41" w:name="_Toc240268425"/>
+      <w:bookmarkStart w:id="41" w:name="_Toc240277923"/>
       <w:r>
         <w:rPr>
           <w:b/>
@@ -17802,7 +17808,7 @@
         <w:pStyle w:val="Heading4"/>
         <w:spacing w:before="220" w:after="120"/>
       </w:pPr>
-      <w:bookmarkStart w:id="42" w:name="_Toc240268426"/>
+      <w:bookmarkStart w:id="42" w:name="_Toc240277924"/>
       <w:r>
         <w:rPr>
           <w:b/>
@@ -17869,7 +17875,7 @@
         <w:pStyle w:val="Heading4"/>
         <w:spacing w:before="220" w:after="120"/>
       </w:pPr>
-      <w:bookmarkStart w:id="43" w:name="_Toc240268427"/>
+      <w:bookmarkStart w:id="43" w:name="_Toc240277925"/>
       <w:r>
         <w:rPr>
           <w:b/>
@@ -17964,7 +17970,7 @@
         <w:pStyle w:val="Heading4"/>
         <w:spacing w:before="220" w:after="120"/>
       </w:pPr>
-      <w:bookmarkStart w:id="44" w:name="_Toc240268428"/>
+      <w:bookmarkStart w:id="44" w:name="_Toc240277926"/>
       <w:r>
         <w:rPr>
           <w:b/>
@@ -18274,7 +18280,7 @@
         <w:pStyle w:val="Heading1"/>
         <w:spacing w:before="480" w:after="240"/>
       </w:pPr>
-      <w:bookmarkStart w:id="45" w:name="_Toc240268429"/>
+      <w:bookmarkStart w:id="45" w:name="_Toc240277927"/>
       <w:r>
         <w:rPr>
           <w:b/>
@@ -18506,7 +18512,7 @@
         <w:pStyle w:val="Heading2"/>
         <w:spacing w:before="360" w:after="180"/>
       </w:pPr>
-      <w:bookmarkStart w:id="46" w:name="_Toc240268430"/>
+      <w:bookmarkStart w:id="46" w:name="_Toc240277928"/>
       <w:r>
         <w:rPr>
           <w:b/>
@@ -18573,7 +18579,7 @@
         <w:pStyle w:val="Heading2"/>
         <w:spacing w:before="360" w:after="180"/>
       </w:pPr>
-      <w:bookmarkStart w:id="47" w:name="_Toc240268431"/>
+      <w:bookmarkStart w:id="47" w:name="_Toc240277929"/>
       <w:r>
         <w:rPr>
           <w:b/>
@@ -18612,7 +18618,7 @@
         <w:pStyle w:val="Heading2"/>
         <w:spacing w:before="360" w:after="180"/>
       </w:pPr>
-      <w:bookmarkStart w:id="48" w:name="_Toc240268432"/>
+      <w:bookmarkStart w:id="48" w:name="_Toc240277930"/>
       <w:r>
         <w:rPr>
           <w:b/>
@@ -18796,7 +18802,7 @@
         <w:pStyle w:val="Heading2"/>
         <w:spacing w:before="360" w:after="180"/>
       </w:pPr>
-      <w:bookmarkStart w:id="49" w:name="_Toc240268433"/>
+      <w:bookmarkStart w:id="49" w:name="_Toc240277931"/>
       <w:r>
         <w:rPr>
           <w:b/>
@@ -18911,7 +18917,7 @@
         <w:pStyle w:val="Heading1"/>
         <w:spacing w:before="480" w:after="240"/>
       </w:pPr>
-      <w:bookmarkStart w:id="50" w:name="_Toc240268434"/>
+      <w:bookmarkStart w:id="50" w:name="_Toc240277932"/>
       <w:r>
         <w:rPr>
           <w:b/>
@@ -19143,7 +19149,7 @@
         <w:pStyle w:val="Heading2"/>
         <w:spacing w:before="360" w:after="180"/>
       </w:pPr>
-      <w:bookmarkStart w:id="51" w:name="_Toc240268435"/>
+      <w:bookmarkStart w:id="51" w:name="_Toc240277933"/>
       <w:r>
         <w:rPr>
           <w:b/>
@@ -19173,7 +19179,7 @@
         <w:pStyle w:val="Heading2"/>
         <w:spacing w:before="360" w:after="180"/>
       </w:pPr>
-      <w:bookmarkStart w:id="52" w:name="_Toc240268436"/>
+      <w:bookmarkStart w:id="52" w:name="_Toc240277934"/>
       <w:r>
         <w:rPr>
           <w:b/>
@@ -19215,7 +19221,7 @@
         <w:pStyle w:val="Heading2"/>
         <w:spacing w:before="360" w:after="180"/>
       </w:pPr>
-      <w:bookmarkStart w:id="53" w:name="_Toc240268437"/>
+      <w:bookmarkStart w:id="53" w:name="_Toc240277935"/>
       <w:r>
         <w:rPr>
           <w:b/>
@@ -19380,7 +19386,7 @@
         <w:pStyle w:val="Heading2"/>
         <w:spacing w:before="360" w:after="180"/>
       </w:pPr>
-      <w:bookmarkStart w:id="54" w:name="_Toc240268438"/>
+      <w:bookmarkStart w:id="54" w:name="_Toc240277936"/>
       <w:r>
         <w:rPr>
           <w:b/>
@@ -19446,7 +19452,7 @@
         <w:pStyle w:val="Heading2"/>
         <w:spacing w:before="360" w:after="180"/>
       </w:pPr>
-      <w:bookmarkStart w:id="55" w:name="_Toc240268439"/>
+      <w:bookmarkStart w:id="55" w:name="_Toc240277937"/>
       <w:r>
         <w:rPr>
           <w:b/>
@@ -19550,7 +19556,7 @@
         <w:pStyle w:val="Heading1"/>
         <w:spacing w:before="480" w:after="240"/>
       </w:pPr>
-      <w:bookmarkStart w:id="56" w:name="_Toc240268440"/>
+      <w:bookmarkStart w:id="56" w:name="_Toc240277938"/>
       <w:r>
         <w:rPr>
           <w:b/>
@@ -19782,7 +19788,7 @@
         <w:pStyle w:val="Heading2"/>
         <w:spacing w:before="360" w:after="180"/>
       </w:pPr>
-      <w:bookmarkStart w:id="57" w:name="_Toc240268441"/>
+      <w:bookmarkStart w:id="57" w:name="_Toc240277939"/>
       <w:r>
         <w:rPr>
           <w:b/>
@@ -19830,7 +19836,7 @@
         <w:pStyle w:val="Heading2"/>
         <w:spacing w:before="360" w:after="180"/>
       </w:pPr>
-      <w:bookmarkStart w:id="58" w:name="_Toc240268442"/>
+      <w:bookmarkStart w:id="58" w:name="_Toc240277940"/>
       <w:r>
         <w:rPr>
           <w:b/>
@@ -19965,7 +19971,7 @@
         <w:pStyle w:val="Heading2"/>
         <w:spacing w:before="360" w:after="180"/>
       </w:pPr>
-      <w:bookmarkStart w:id="59" w:name="_Toc240268443"/>
+      <w:bookmarkStart w:id="59" w:name="_Toc240277941"/>
       <w:r>
         <w:rPr>
           <w:b/>
@@ -20116,7 +20122,7 @@
         <w:pStyle w:val="Heading1"/>
         <w:spacing w:before="480" w:after="240"/>
       </w:pPr>
-      <w:bookmarkStart w:id="60" w:name="_Toc240268444"/>
+      <w:bookmarkStart w:id="60" w:name="_Toc240277942"/>
       <w:r>
         <w:rPr>
           <w:b/>
@@ -20348,7 +20354,7 @@
         <w:pStyle w:val="Heading2"/>
         <w:spacing w:before="360" w:after="180"/>
       </w:pPr>
-      <w:bookmarkStart w:id="61" w:name="_Toc240268445"/>
+      <w:bookmarkStart w:id="61" w:name="_Toc240277943"/>
       <w:r>
         <w:rPr>
           <w:b/>
@@ -20396,7 +20402,7 @@
         <w:pStyle w:val="Heading2"/>
         <w:spacing w:before="360" w:after="180"/>
       </w:pPr>
-      <w:bookmarkStart w:id="62" w:name="_Toc240268446"/>
+      <w:bookmarkStart w:id="62" w:name="_Toc240277944"/>
       <w:r>
         <w:rPr>
           <w:b/>
@@ -20624,7 +20630,7 @@
         <w:pStyle w:val="Heading2"/>
         <w:spacing w:before="360" w:after="180"/>
       </w:pPr>
-      <w:bookmarkStart w:id="63" w:name="_Toc240268447"/>
+      <w:bookmarkStart w:id="63" w:name="_Toc240277945"/>
       <w:r>
         <w:rPr>
           <w:b/>
@@ -20677,7 +20683,7 @@
         <w:pStyle w:val="Heading2"/>
         <w:spacing w:before="360" w:after="180"/>
       </w:pPr>
-      <w:bookmarkStart w:id="64" w:name="_Toc240268448"/>
+      <w:bookmarkStart w:id="64" w:name="_Toc240277946"/>
       <w:r>
         <w:rPr>
           <w:b/>
@@ -20869,7 +20875,7 @@
         <w:pStyle w:val="Heading1"/>
         <w:spacing w:before="480" w:after="240"/>
       </w:pPr>
-      <w:bookmarkStart w:id="65" w:name="_Toc240268449"/>
+      <w:bookmarkStart w:id="65" w:name="_Toc240277947"/>
       <w:r>
         <w:rPr>
           <w:b/>
@@ -21101,7 +21107,7 @@
         <w:pStyle w:val="Heading2"/>
         <w:spacing w:before="360" w:after="180"/>
       </w:pPr>
-      <w:bookmarkStart w:id="66" w:name="_Toc240268450"/>
+      <w:bookmarkStart w:id="66" w:name="_Toc240277948"/>
       <w:r>
         <w:rPr>
           <w:b/>
@@ -21404,7 +21410,7 @@
         <w:pStyle w:val="Heading2"/>
         <w:spacing w:before="360" w:after="180"/>
       </w:pPr>
-      <w:bookmarkStart w:id="67" w:name="_Toc240268451"/>
+      <w:bookmarkStart w:id="67" w:name="_Toc240277949"/>
       <w:r>
         <w:rPr>
           <w:b/>
@@ -21523,7 +21529,7 @@
         <w:pStyle w:val="Heading2"/>
         <w:spacing w:before="360" w:after="180"/>
       </w:pPr>
-      <w:bookmarkStart w:id="68" w:name="_Toc240268452"/>
+      <w:bookmarkStart w:id="68" w:name="_Toc240277950"/>
       <w:r>
         <w:rPr>
           <w:b/>
@@ -21643,7 +21649,7 @@
         <w:pStyle w:val="Heading2"/>
         <w:spacing w:before="360" w:after="180"/>
       </w:pPr>
-      <w:bookmarkStart w:id="69" w:name="_Toc240268453"/>
+      <w:bookmarkStart w:id="69" w:name="_Toc240277951"/>
       <w:r>
         <w:rPr>
           <w:b/>
@@ -21906,7 +21912,7 @@
         <w:pStyle w:val="Heading2"/>
         <w:spacing w:before="360" w:after="180"/>
       </w:pPr>
-      <w:bookmarkStart w:id="70" w:name="_Toc240268454"/>
+      <w:bookmarkStart w:id="70" w:name="_Toc240277952"/>
       <w:r>
         <w:rPr>
           <w:b/>
@@ -22077,7 +22083,7 @@
         <w:pStyle w:val="Heading1"/>
         <w:spacing w:before="480" w:after="240"/>
       </w:pPr>
-      <w:bookmarkStart w:id="71" w:name="_Toc240268455"/>
+      <w:bookmarkStart w:id="71" w:name="_Toc240277953"/>
       <w:r>
         <w:rPr>
           <w:b/>
@@ -22309,7 +22315,7 @@
         <w:pStyle w:val="Heading2"/>
         <w:spacing w:before="360" w:after="180"/>
       </w:pPr>
-      <w:bookmarkStart w:id="72" w:name="_Toc240268456"/>
+      <w:bookmarkStart w:id="72" w:name="_Toc240277954"/>
       <w:r>
         <w:rPr>
           <w:b/>
@@ -22445,7 +22451,7 @@
         <w:pStyle w:val="Heading2"/>
         <w:spacing w:before="360" w:after="180"/>
       </w:pPr>
-      <w:bookmarkStart w:id="73" w:name="_Toc240268457"/>
+      <w:bookmarkStart w:id="73" w:name="_Toc240277955"/>
       <w:r>
         <w:rPr>
           <w:b/>
@@ -22725,7 +22731,7 @@
         <w:pStyle w:val="Heading2"/>
         <w:spacing w:before="360" w:after="180"/>
       </w:pPr>
-      <w:bookmarkStart w:id="74" w:name="_Toc240268458"/>
+      <w:bookmarkStart w:id="74" w:name="_Toc240277956"/>
       <w:r>
         <w:rPr>
           <w:b/>
@@ -22903,7 +22909,7 @@
         <w:pStyle w:val="Heading1"/>
         <w:spacing w:before="480" w:after="240"/>
       </w:pPr>
-      <w:bookmarkStart w:id="75" w:name="_Toc240268459"/>
+      <w:bookmarkStart w:id="75" w:name="_Toc240277957"/>
       <w:r>
         <w:rPr>
           <w:b/>
@@ -23135,7 +23141,7 @@
         <w:pStyle w:val="Heading2"/>
         <w:spacing w:before="360" w:after="180"/>
       </w:pPr>
-      <w:bookmarkStart w:id="76" w:name="_Toc240268460"/>
+      <w:bookmarkStart w:id="76" w:name="_Toc240277958"/>
       <w:r>
         <w:rPr>
           <w:b/>
@@ -23313,7 +23319,7 @@
         <w:pStyle w:val="Heading2"/>
         <w:spacing w:before="360" w:after="180"/>
       </w:pPr>
-      <w:bookmarkStart w:id="77" w:name="_Toc240268461"/>
+      <w:bookmarkStart w:id="77" w:name="_Toc240277959"/>
       <w:r>
         <w:rPr>
           <w:b/>
@@ -23520,7 +23526,7 @@
         <w:pStyle w:val="Heading2"/>
         <w:spacing w:before="360" w:after="180"/>
       </w:pPr>
-      <w:bookmarkStart w:id="78" w:name="_Toc240268462"/>
+      <w:bookmarkStart w:id="78" w:name="_Toc240277960"/>
       <w:r>
         <w:rPr>
           <w:b/>
@@ -23589,7 +23595,7 @@
         <w:pStyle w:val="Heading2"/>
         <w:spacing w:before="360" w:after="180"/>
       </w:pPr>
-      <w:bookmarkStart w:id="79" w:name="_Toc240268463"/>
+      <w:bookmarkStart w:id="79" w:name="_Toc240277961"/>
       <w:r>
         <w:rPr>
           <w:b/>
@@ -23655,7 +23661,7 @@
         <w:pStyle w:val="Heading2"/>
         <w:spacing w:before="360" w:after="180"/>
       </w:pPr>
-      <w:bookmarkStart w:id="80" w:name="_Toc240268464"/>
+      <w:bookmarkStart w:id="80" w:name="_Toc240277962"/>
       <w:r>
         <w:rPr>
           <w:b/>
@@ -23929,7 +23935,7 @@
         <w:pStyle w:val="Heading2"/>
         <w:spacing w:before="360" w:after="180"/>
       </w:pPr>
-      <w:bookmarkStart w:id="81" w:name="_Toc240268465"/>
+      <w:bookmarkStart w:id="81" w:name="_Toc240277963"/>
       <w:r>
         <w:rPr>
           <w:b/>
@@ -24118,7 +24124,7 @@
         <w:pStyle w:val="Heading2"/>
         <w:spacing w:before="360" w:after="180"/>
       </w:pPr>
-      <w:bookmarkStart w:id="82" w:name="_Toc240268466"/>
+      <w:bookmarkStart w:id="82" w:name="_Toc240277964"/>
       <w:r>
         <w:rPr>
           <w:b/>
@@ -24280,7 +24286,7 @@
         <w:pStyle w:val="Heading1"/>
         <w:spacing w:before="480" w:after="240"/>
       </w:pPr>
-      <w:bookmarkStart w:id="83" w:name="_Toc240268467"/>
+      <w:bookmarkStart w:id="83" w:name="_Toc240277965"/>
       <w:r>
         <w:rPr>
           <w:b/>
@@ -24512,7 +24518,7 @@
         <w:pStyle w:val="Heading2"/>
         <w:spacing w:before="360" w:after="180"/>
       </w:pPr>
-      <w:bookmarkStart w:id="84" w:name="_Toc240268468"/>
+      <w:bookmarkStart w:id="84" w:name="_Toc240277966"/>
       <w:r>
         <w:rPr>
           <w:b/>
@@ -24577,7 +24583,7 @@
         <w:pStyle w:val="Heading2"/>
         <w:spacing w:before="360" w:after="180"/>
       </w:pPr>
-      <w:bookmarkStart w:id="85" w:name="_Toc240268469"/>
+      <w:bookmarkStart w:id="85" w:name="_Toc240277967"/>
       <w:r>
         <w:rPr>
           <w:b/>
@@ -24760,7 +24766,7 @@
         <w:pStyle w:val="Heading2"/>
         <w:spacing w:before="360" w:after="180"/>
       </w:pPr>
-      <w:bookmarkStart w:id="86" w:name="_Toc240268470"/>
+      <w:bookmarkStart w:id="86" w:name="_Toc240277968"/>
       <w:r>
         <w:rPr>
           <w:b/>
@@ -24943,7 +24949,7 @@
         <w:pStyle w:val="Heading2"/>
         <w:spacing w:before="360" w:after="180"/>
       </w:pPr>
-      <w:bookmarkStart w:id="87" w:name="_Toc240268471"/>
+      <w:bookmarkStart w:id="87" w:name="_Toc240277969"/>
       <w:r>
         <w:rPr>
           <w:b/>
@@ -25080,7 +25086,7 @@
         <w:pStyle w:val="Heading2"/>
         <w:spacing w:before="360" w:after="180"/>
       </w:pPr>
-      <w:bookmarkStart w:id="88" w:name="_Toc240268472"/>
+      <w:bookmarkStart w:id="88" w:name="_Toc240277970"/>
       <w:r>
         <w:rPr>
           <w:b/>
@@ -25308,7 +25314,7 @@
         <w:pStyle w:val="Heading2"/>
         <w:spacing w:before="360" w:after="180"/>
       </w:pPr>
-      <w:bookmarkStart w:id="89" w:name="_Toc240268473"/>
+      <w:bookmarkStart w:id="89" w:name="_Toc240277971"/>
       <w:r>
         <w:rPr>
           <w:b/>
@@ -25610,7 +25616,7 @@
         <w:pStyle w:val="Heading1"/>
         <w:spacing w:before="480" w:after="240"/>
       </w:pPr>
-      <w:bookmarkStart w:id="90" w:name="_Toc240268474"/>
+      <w:bookmarkStart w:id="90" w:name="_Toc240277972"/>
       <w:r>
         <w:rPr>
           <w:b/>
@@ -25635,7 +25641,7 @@
         <w:pStyle w:val="Heading3"/>
         <w:spacing w:before="280" w:after="140"/>
       </w:pPr>
-      <w:bookmarkStart w:id="91" w:name="_Toc240268475"/>
+      <w:bookmarkStart w:id="91" w:name="_Toc240277973"/>
       <w:r>
         <w:rPr>
           <w:b/>
@@ -26341,7 +26347,7 @@
         <w:pStyle w:val="Heading3"/>
         <w:spacing w:before="280" w:after="140"/>
       </w:pPr>
-      <w:bookmarkStart w:id="92" w:name="_Toc240268476"/>
+      <w:bookmarkStart w:id="92" w:name="_Toc240277974"/>
       <w:r>
         <w:rPr>
           <w:b/>
@@ -26696,7 +26702,7 @@
         <w:pStyle w:val="Heading3"/>
         <w:spacing w:before="280" w:after="140"/>
       </w:pPr>
-      <w:bookmarkStart w:id="93" w:name="_Toc240268477"/>
+      <w:bookmarkStart w:id="93" w:name="_Toc240277975"/>
       <w:r>
         <w:rPr>
           <w:b/>
@@ -27124,7 +27130,7 @@
         <w:pStyle w:val="Heading3"/>
         <w:spacing w:before="280" w:after="140"/>
       </w:pPr>
-      <w:bookmarkStart w:id="94" w:name="_Toc240268478"/>
+      <w:bookmarkStart w:id="94" w:name="_Toc240277976"/>
       <w:r>
         <w:rPr>
           <w:b/>
@@ -27537,7 +27543,7 @@
         <w:pStyle w:val="Heading3"/>
         <w:spacing w:before="280" w:after="140"/>
       </w:pPr>
-      <w:bookmarkStart w:id="95" w:name="_Toc240268479"/>
+      <w:bookmarkStart w:id="95" w:name="_Toc240277977"/>
       <w:r>
         <w:rPr>
           <w:b/>
@@ -27867,7 +27873,7 @@
         <w:pStyle w:val="Heading1"/>
         <w:spacing w:before="480" w:after="240"/>
       </w:pPr>
-      <w:bookmarkStart w:id="96" w:name="_Toc240268480"/>
+      <w:bookmarkStart w:id="96" w:name="_Toc240277978"/>
       <w:r>
         <w:rPr>
           <w:b/>
@@ -27892,7 +27898,7 @@
         <w:pStyle w:val="Heading3"/>
         <w:spacing w:before="280" w:after="140"/>
       </w:pPr>
-      <w:bookmarkStart w:id="97" w:name="_Toc240268481"/>
+      <w:bookmarkStart w:id="97" w:name="_Toc240277979"/>
       <w:r>
         <w:rPr>
           <w:b/>
@@ -28077,7 +28083,7 @@
         <w:pStyle w:val="Heading3"/>
         <w:spacing w:before="280" w:after="140"/>
       </w:pPr>
-      <w:bookmarkStart w:id="98" w:name="_Toc240268482"/>
+      <w:bookmarkStart w:id="98" w:name="_Toc240277980"/>
       <w:r>
         <w:rPr>
           <w:b/>
@@ -28262,7 +28268,7 @@
         <w:pStyle w:val="Heading3"/>
         <w:spacing w:before="280" w:after="140"/>
       </w:pPr>
-      <w:bookmarkStart w:id="99" w:name="_Toc240268483"/>
+      <w:bookmarkStart w:id="99" w:name="_Toc240277981"/>
       <w:r>
         <w:rPr>
           <w:b/>
@@ -28401,7 +28407,7 @@
         <w:pStyle w:val="Heading3"/>
         <w:spacing w:before="280" w:after="140"/>
       </w:pPr>
-      <w:bookmarkStart w:id="100" w:name="_Toc240268484"/>
+      <w:bookmarkStart w:id="100" w:name="_Toc240277982"/>
       <w:r>
         <w:rPr>
           <w:b/>
@@ -28591,7 +28597,7 @@
         <w:pStyle w:val="Heading1"/>
         <w:spacing w:before="480" w:after="240"/>
       </w:pPr>
-      <w:bookmarkStart w:id="101" w:name="_Toc240268485"/>
+      <w:bookmarkStart w:id="101" w:name="_Toc240277983"/>
       <w:r>
         <w:rPr>
           <w:b/>
@@ -28616,7 +28622,7 @@
         <w:pStyle w:val="Heading3"/>
         <w:spacing w:before="280" w:after="140"/>
       </w:pPr>
-      <w:bookmarkStart w:id="102" w:name="_Toc240268486"/>
+      <w:bookmarkStart w:id="102" w:name="_Toc240277984"/>
       <w:r>
         <w:rPr>
           <w:b/>
@@ -29035,7 +29041,7 @@
         <w:pStyle w:val="Heading3"/>
         <w:spacing w:before="280" w:after="140"/>
       </w:pPr>
-      <w:bookmarkStart w:id="103" w:name="_Toc240268487"/>
+      <w:bookmarkStart w:id="103" w:name="_Toc240277985"/>
       <w:r>
         <w:rPr>
           <w:b/>
@@ -29487,7 +29493,7 @@
         <w:pStyle w:val="Heading3"/>
         <w:spacing w:before="280" w:after="140"/>
       </w:pPr>
-      <w:bookmarkStart w:id="104" w:name="_Toc240268488"/>
+      <w:bookmarkStart w:id="104" w:name="_Toc240277986"/>
       <w:r>
         <w:rPr>
           <w:b/>
@@ -29883,7 +29889,7 @@
         <w:pStyle w:val="Heading3"/>
         <w:spacing w:before="280" w:after="140"/>
       </w:pPr>
-      <w:bookmarkStart w:id="105" w:name="_Toc240268489"/>
+      <w:bookmarkStart w:id="105" w:name="_Toc240277987"/>
       <w:r>
         <w:rPr>
           <w:b/>
@@ -30207,7 +30213,7 @@
         <w:pStyle w:val="Heading1"/>
         <w:spacing w:before="480" w:after="240"/>
       </w:pPr>
-      <w:bookmarkStart w:id="106" w:name="_Toc240268490"/>
+      <w:bookmarkStart w:id="106" w:name="_Toc240277988"/>
       <w:r>
         <w:rPr>
           <w:b/>
@@ -30224,7 +30230,7 @@
         <w:pStyle w:val="Heading3"/>
         <w:spacing w:before="280" w:after="140"/>
       </w:pPr>
-      <w:bookmarkStart w:id="107" w:name="_Toc240268491"/>
+      <w:bookmarkStart w:id="107" w:name="_Toc240277989"/>
       <w:r>
         <w:rPr>
           <w:b/>
@@ -31569,7 +31575,7 @@
         <w:pStyle w:val="Heading3"/>
         <w:spacing w:before="280" w:after="140"/>
       </w:pPr>
-      <w:bookmarkStart w:id="108" w:name="_Toc240268492"/>
+      <w:bookmarkStart w:id="108" w:name="_Toc240277990"/>
       <w:r>
         <w:rPr>
           <w:b/>
@@ -31911,7 +31917,7 @@
         <w:pStyle w:val="Heading1"/>
         <w:spacing w:before="480" w:after="240"/>
       </w:pPr>
-      <w:bookmarkStart w:id="109" w:name="_Toc240268493"/>
+      <w:bookmarkStart w:id="109" w:name="_Toc240277991"/>
       <w:r>
         <w:rPr>
           <w:b/>
@@ -31928,7 +31934,7 @@
         <w:pStyle w:val="Heading3"/>
         <w:spacing w:before="280" w:after="140"/>
       </w:pPr>
-      <w:bookmarkStart w:id="110" w:name="_Toc240268494"/>
+      <w:bookmarkStart w:id="110" w:name="_Toc240277992"/>
       <w:r>
         <w:rPr>
           <w:b/>
@@ -31945,7 +31951,7 @@
       <w:pPr>
         <w:spacing w:after="120"/>
       </w:pPr>
-      <w:hyperlink r:id="rId5" w:history="1">
+      <w:hyperlink r:id="rId7" w:history="1">
         <w:r>
           <w:rPr>
             <w:rStyle w:val="Hyperlink"/>
@@ -31959,7 +31965,7 @@
         <w:pStyle w:val="Heading3"/>
         <w:spacing w:before="280" w:after="140"/>
       </w:pPr>
-      <w:bookmarkStart w:id="111" w:name="_Toc240268495"/>
+      <w:bookmarkStart w:id="111" w:name="_Toc240277993"/>
       <w:r>
         <w:rPr>
           <w:b/>
@@ -31976,7 +31982,7 @@
       <w:pPr>
         <w:spacing w:after="120"/>
       </w:pPr>
-      <w:hyperlink r:id="rId6" w:history="1">
+      <w:hyperlink r:id="rId8" w:history="1">
         <w:r>
           <w:rPr>
             <w:rStyle w:val="Hyperlink"/>
@@ -31989,7 +31995,7 @@
       <w:pPr>
         <w:spacing w:after="120"/>
       </w:pPr>
-      <w:hyperlink r:id="rId7" w:history="1">
+      <w:hyperlink r:id="rId9" w:history="1">
         <w:r>
           <w:rPr>
             <w:rStyle w:val="Hyperlink"/>
@@ -32003,7 +32009,7 @@
         <w:pStyle w:val="Heading3"/>
         <w:spacing w:before="280" w:after="140"/>
       </w:pPr>
-      <w:bookmarkStart w:id="112" w:name="_Toc240268496"/>
+      <w:bookmarkStart w:id="112" w:name="_Toc240277994"/>
       <w:r>
         <w:rPr>
           <w:b/>
@@ -32020,7 +32026,7 @@
       <w:pPr>
         <w:spacing w:after="120"/>
       </w:pPr>
-      <w:hyperlink r:id="rId8" w:history="1">
+      <w:hyperlink r:id="rId10" w:history="1">
         <w:r>
           <w:rPr>
             <w:rStyle w:val="Hyperlink"/>
@@ -32033,7 +32039,7 @@
       <w:pPr>
         <w:spacing w:after="120"/>
       </w:pPr>
-      <w:hyperlink r:id="rId9" w:history="1">
+      <w:hyperlink r:id="rId11" w:history="1">
         <w:r>
           <w:rPr>
             <w:rStyle w:val="Hyperlink"/>
@@ -32047,7 +32053,7 @@
         <w:pStyle w:val="Heading3"/>
         <w:spacing w:before="280" w:after="140"/>
       </w:pPr>
-      <w:bookmarkStart w:id="113" w:name="_Toc240268497"/>
+      <w:bookmarkStart w:id="113" w:name="_Toc240277995"/>
       <w:r>
         <w:rPr>
           <w:b/>
@@ -32064,7 +32070,7 @@
       <w:pPr>
         <w:spacing w:after="120"/>
       </w:pPr>
-      <w:hyperlink r:id="rId10" w:history="1">
+      <w:hyperlink r:id="rId12" w:history="1">
         <w:r>
           <w:rPr>
             <w:rStyle w:val="Hyperlink"/>
@@ -32077,7 +32083,7 @@
       <w:pPr>
         <w:spacing w:after="120"/>
       </w:pPr>
-      <w:hyperlink r:id="rId11" w:history="1">
+      <w:hyperlink r:id="rId13" w:history="1">
         <w:r>
           <w:rPr>
             <w:rStyle w:val="Hyperlink"/>
@@ -32091,7 +32097,7 @@
         <w:pStyle w:val="Heading3"/>
         <w:spacing w:before="280" w:after="140"/>
       </w:pPr>
-      <w:bookmarkStart w:id="114" w:name="_Toc240268498"/>
+      <w:bookmarkStart w:id="114" w:name="_Toc240277996"/>
       <w:r>
         <w:rPr>
           <w:b/>
@@ -32108,7 +32114,7 @@
       <w:pPr>
         <w:spacing w:after="120"/>
       </w:pPr>
-      <w:hyperlink r:id="rId12" w:history="1">
+      <w:hyperlink r:id="rId14" w:history="1">
         <w:r>
           <w:rPr>
             <w:rStyle w:val="Hyperlink"/>
@@ -32121,7 +32127,7 @@
       <w:pPr>
         <w:spacing w:after="120"/>
       </w:pPr>
-      <w:hyperlink r:id="rId13" w:history="1">
+      <w:hyperlink r:id="rId15" w:history="1">
         <w:r>
           <w:rPr>
             <w:rStyle w:val="Hyperlink"/>
@@ -32134,7 +32140,7 @@
       <w:pPr>
         <w:spacing w:after="120"/>
       </w:pPr>
-      <w:hyperlink r:id="rId14" w:history="1">
+      <w:hyperlink r:id="rId16" w:history="1">
         <w:r>
           <w:rPr>
             <w:rStyle w:val="Hyperlink"/>
@@ -32153,7 +32159,7 @@
         <w:pStyle w:val="Heading1"/>
         <w:spacing w:before="480" w:after="240"/>
       </w:pPr>
-      <w:bookmarkStart w:id="115" w:name="_Toc240268499"/>
+      <w:bookmarkStart w:id="115" w:name="_Toc240277997"/>
       <w:r>
         <w:rPr>
           <w:b/>
@@ -32170,7 +32176,7 @@
         <w:pStyle w:val="Heading3"/>
         <w:spacing w:before="280" w:after="140"/>
       </w:pPr>
-      <w:bookmarkStart w:id="116" w:name="_Toc240268500"/>
+      <w:bookmarkStart w:id="116" w:name="_Toc240277998"/>
       <w:r>
         <w:rPr>
           <w:b/>
@@ -32214,7 +32220,7 @@
         <w:pStyle w:val="Heading3"/>
         <w:spacing w:before="280" w:after="140"/>
       </w:pPr>
-      <w:bookmarkStart w:id="117" w:name="_Toc240268501"/>
+      <w:bookmarkStart w:id="117" w:name="_Toc240277999"/>
       <w:r>
         <w:rPr>
           <w:b/>
@@ -32232,7 +32238,7 @@
         <w:pStyle w:val="Heading4"/>
         <w:spacing w:before="220" w:after="120"/>
       </w:pPr>
-      <w:bookmarkStart w:id="118" w:name="_Toc240268502"/>
+      <w:bookmarkStart w:id="118" w:name="_Toc240278000"/>
       <w:r>
         <w:rPr>
           <w:b/>
@@ -32255,7 +32261,7 @@
         <w:pStyle w:val="Heading4"/>
         <w:spacing w:before="220" w:after="120"/>
       </w:pPr>
-      <w:bookmarkStart w:id="119" w:name="_Toc240268503"/>
+      <w:bookmarkStart w:id="119" w:name="_Toc240278001"/>
       <w:r>
         <w:rPr>
           <w:b/>
@@ -32296,7 +32302,7 @@
         <w:pStyle w:val="Heading4"/>
         <w:spacing w:before="220" w:after="120"/>
       </w:pPr>
-      <w:bookmarkStart w:id="120" w:name="_Toc240268504"/>
+      <w:bookmarkStart w:id="120" w:name="_Toc240278002"/>
       <w:r>
         <w:rPr>
           <w:b/>
@@ -32319,7 +32325,7 @@
         <w:pStyle w:val="Heading3"/>
         <w:spacing w:before="280" w:after="140"/>
       </w:pPr>
-      <w:bookmarkStart w:id="121" w:name="_Toc240268505"/>
+      <w:bookmarkStart w:id="121" w:name="_Toc240278003"/>
       <w:r>
         <w:rPr>
           <w:b/>
@@ -32771,7 +32777,7 @@
         <w:pStyle w:val="Heading3"/>
         <w:spacing w:before="280" w:after="140"/>
       </w:pPr>
-      <w:bookmarkStart w:id="122" w:name="_Toc240268506"/>
+      <w:bookmarkStart w:id="122" w:name="_Toc240278004"/>
       <w:r>
         <w:rPr>
           <w:b/>
@@ -32841,7 +32847,7 @@
         <w:pStyle w:val="Heading3"/>
         <w:spacing w:before="280" w:after="140"/>
       </w:pPr>
-      <w:bookmarkStart w:id="123" w:name="_Toc240268507"/>
+      <w:bookmarkStart w:id="123" w:name="_Toc240278005"/>
       <w:r>
         <w:rPr>
           <w:b/>

</xml_diff>